<commit_message>
Sync updated Tier Sheet (H-grade window 7 days -> 4 days)
No code changes. Document sync only, matching the H-grade "Missed"
threshold to the repo's existing 4-day observation window.
</commit_message>
<xml_diff>
--- a/docs/Novus_Tier_Sheets_Updated_2026-08-14.docx
+++ b/docs/Novus_Tier_Sheets_Updated_2026-08-14.docx
@@ -1,6 +1,6 @@
 
 <file path=word/document.xml><?xml version="1.0" encoding="utf-8"?>
-<w:document xmlns:wpc="http://schemas.microsoft.com/office/word/2010/wordprocessingCanvas" xmlns:mc="http://schemas.openxmlformats.org/markup-compatibility/2006" xmlns:o="urn:schemas-microsoft-com:office:office" xmlns:r="http://schemas.openxmlformats.org/officeDocument/2006/relationships" xmlns:m="http://schemas.openxmlformats.org/officeDocument/2006/math" xmlns:v="urn:schemas-microsoft-com:vml" xmlns:wp14="http://schemas.microsoft.com/office/word/2010/wordprocessingDrawing" xmlns:wp="http://schemas.openxmlformats.org/drawingml/2006/wordprocessingDrawing" xmlns:w10="urn:schemas-microsoft-com:office:word" xmlns:w="http://schemas.openxmlformats.org/wordprocessingml/2006/main" xmlns:w14="http://schemas.microsoft.com/office/word/2010/wordml" xmlns:w15="http://schemas.microsoft.com/office/word/2012/wordml" xmlns:wpg="http://schemas.microsoft.com/office/word/2010/wordprocessingGroup" xmlns:wpi="http://schemas.microsoft.com/office/word/2010/wordprocessingInk" xmlns:wne="http://schemas.microsoft.com/office/word/2006/wordml" xmlns:wps="http://schemas.microsoft.com/office/word/2010/wordprocessingShape" xmlns:cx="http://schemas.microsoft.com/office/drawing/2014/chartex" xmlns:cx1="http://schemas.microsoft.com/office/drawing/2015/9/8/chartex" xmlns:cx2="http://schemas.microsoft.com/office/drawing/2015/10/21/chartex" xmlns:cx3="http://schemas.microsoft.com/office/drawing/2016/5/9/chartex" xmlns:cx4="http://schemas.microsoft.com/office/drawing/2016/5/10/chartex" xmlns:cx5="http://schemas.microsoft.com/office/drawing/2016/5/11/chartex" xmlns:cx6="http://schemas.microsoft.com/office/drawing/2016/5/12/chartex" xmlns:cx7="http://schemas.microsoft.com/office/drawing/2016/5/13/chartex" xmlns:cx8="http://schemas.microsoft.com/office/drawing/2016/5/14/chartex" xmlns:aink="http://schemas.microsoft.com/office/drawing/2016/ink" xmlns:am3d="http://schemas.microsoft.com/office/drawing/2017/model3d" xmlns:w16cex="http://schemas.microsoft.com/office/word/2018/wordml/cex" xmlns:w16cid="http://schemas.microsoft.com/office/word/2016/wordml/cid" xmlns:w16="http://schemas.microsoft.com/office/word/2018/wordml" xmlns:w16sdtdh="http://schemas.microsoft.com/office/word/2020/wordml/sdtdatahash" xmlns:w16se="http://schemas.microsoft.com/office/word/2015/wordml/symex" mc:Ignorable="w14 w15 wp14">
+<w:document xmlns:wpc="http://schemas.microsoft.com/office/word/2010/wordprocessingCanvas" xmlns:cx="http://schemas.microsoft.com/office/drawing/2014/chartex" xmlns:cx1="http://schemas.microsoft.com/office/drawing/2015/9/8/chartex" xmlns:cx2="http://schemas.microsoft.com/office/drawing/2015/10/21/chartex" xmlns:cx3="http://schemas.microsoft.com/office/drawing/2016/5/9/chartex" xmlns:cx4="http://schemas.microsoft.com/office/drawing/2016/5/10/chartex" xmlns:cx5="http://schemas.microsoft.com/office/drawing/2016/5/11/chartex" xmlns:cx6="http://schemas.microsoft.com/office/drawing/2016/5/12/chartex" xmlns:cx7="http://schemas.microsoft.com/office/drawing/2016/5/13/chartex" xmlns:cx8="http://schemas.microsoft.com/office/drawing/2016/5/14/chartex" xmlns:mc="http://schemas.openxmlformats.org/markup-compatibility/2006" xmlns:aink="http://schemas.microsoft.com/office/drawing/2016/ink" xmlns:am3d="http://schemas.microsoft.com/office/drawing/2017/model3d" xmlns:o="urn:schemas-microsoft-com:office:office" xmlns:oel="http://schemas.microsoft.com/office/2019/extlst" xmlns:r="http://schemas.openxmlformats.org/officeDocument/2006/relationships" xmlns:m="http://schemas.openxmlformats.org/officeDocument/2006/math" xmlns:v="urn:schemas-microsoft-com:vml" xmlns:wp14="http://schemas.microsoft.com/office/word/2010/wordprocessingDrawing" xmlns:wp="http://schemas.openxmlformats.org/drawingml/2006/wordprocessingDrawing" xmlns:w10="urn:schemas-microsoft-com:office:word" xmlns:w="http://schemas.openxmlformats.org/wordprocessingml/2006/main" xmlns:w14="http://schemas.microsoft.com/office/word/2010/wordml" xmlns:w15="http://schemas.microsoft.com/office/word/2012/wordml" xmlns:w16cei="http://schemas.microsoft.com/office/word/2026/wordml/cei" xmlns:w16cex="http://schemas.microsoft.com/office/word/2018/wordml/cex" xmlns:w16cid="http://schemas.microsoft.com/office/word/2016/wordml/cid" xmlns:w16="http://schemas.microsoft.com/office/word/2018/wordml" xmlns:w16du="http://schemas.microsoft.com/office/word/2023/wordml/word16du" xmlns:w16sdtdh="http://schemas.microsoft.com/office/word/2020/wordml/sdtdatahash" xmlns:w16sdtfl="http://schemas.microsoft.com/office/word/2024/wordml/sdtformatlock" xmlns:w16se="http://schemas.microsoft.com/office/word/2015/wordml/symex" xmlns:wpg="http://schemas.microsoft.com/office/word/2010/wordprocessingGroup" xmlns:wpi="http://schemas.microsoft.com/office/word/2010/wordprocessingInk" xmlns:wne="http://schemas.microsoft.com/office/word/2006/wordml" xmlns:wps="http://schemas.microsoft.com/office/word/2010/wordprocessingShape" mc:Ignorable="w14 w15 w16se w16cid w16 w16cex w16sdtdh w16sdtfl w16du wp14">
   <w:body>
     <w:p>
       <w:pPr>
@@ -15,7 +15,7 @@
           <w:sz w:val="26"/>
           <w:szCs w:val="26"/>
         </w:rPr>
-        <w:t xml:space="preserve">NOVUS</w:t>
+        <w:t>NOVUS</w:t>
       </w:r>
     </w:p>
     <w:p>
@@ -31,13 +31,13 @@
           <w:sz w:val="48"/>
           <w:szCs w:val="48"/>
         </w:rPr>
-        <w:t xml:space="preserve">Core</w:t>
+        <w:t>Core</w:t>
       </w:r>
     </w:p>
     <w:p>
       <w:pPr>
         <w:pBdr>
-          <w:bottom w:val="single" w:color="C8CDD4" w:sz="6" w:space="8"/>
+          <w:bottom w:val="single" w:sz="6" w:space="8" w:color="C8CDD4"/>
         </w:pBdr>
         <w:spacing w:after="260"/>
       </w:pPr>
@@ -47,7 +47,7 @@
           <w:sz w:val="24"/>
           <w:szCs w:val="24"/>
         </w:rPr>
-        <w:t xml:space="preserve">£299 a month.  No contract.  £350 to set up.</w:t>
+        <w:t>£299 a month.  No contract.  £350 to set up.</w:t>
       </w:r>
     </w:p>
     <w:p>
@@ -58,22 +58,16 @@
         <w:rPr>
           <w:b/>
           <w:bCs/>
-          <w:sz w:val="22"/>
-          <w:szCs w:val="22"/>
         </w:rPr>
         <w:t xml:space="preserve">What it is: </w:t>
       </w:r>
       <w:r>
-        <w:rPr>
-          <w:sz w:val="22"/>
-          <w:szCs w:val="22"/>
-        </w:rPr>
-        <w:t xml:space="preserve">an assistant that answers your phone, your portal enquiries, your website and your emails — trained on your actual listings — and books people into your diary. It works nights, weekends, and every hour your team is out on viewings.</w:t>
-      </w:r>
-    </w:p>
-    <w:p>
-      <w:pPr>
-        <w:spacing w:after="240" w:before="200"/>
+        <w:t>an assistant that answers your phone, your portal enquiries, your website and your emails — trained on your actual listings — and books people into your diary. It works nights, weekends, and every hour your team is out on viewings.</w:t>
+      </w:r>
+    </w:p>
+    <w:p>
+      <w:pPr>
+        <w:spacing w:before="200" w:after="240"/>
       </w:pPr>
       <w:r>
         <w:rPr>
@@ -83,13 +77,13 @@
           <w:sz w:val="28"/>
           <w:szCs w:val="28"/>
         </w:rPr>
-        <w:t xml:space="preserve">Everything else says hello. This one books them in.</w:t>
+        <w:t>Everything else says hello. This one books them in.</w:t>
       </w:r>
     </w:p>
     <w:p>
       <w:pPr>
         <w:keepNext/>
-        <w:spacing w:after="40" w:before="150"/>
+        <w:spacing w:before="150" w:after="40"/>
       </w:pPr>
       <w:r>
         <w:rPr>
@@ -98,7 +92,7 @@
           <w:sz w:val="23"/>
           <w:szCs w:val="23"/>
         </w:rPr>
-        <w:t xml:space="preserve">It books, it doesn't just reply.</w:t>
+        <w:t>It books, it doesn't just reply.</w:t>
       </w:r>
     </w:p>
     <w:p>
@@ -107,17 +101,13 @@
         <w:ind w:left="28"/>
       </w:pPr>
       <w:r>
-        <w:rPr>
-          <w:sz w:val="22"/>
-          <w:szCs w:val="22"/>
-        </w:rPr>
-        <w:t xml:space="preserve">Viewings and valuations land straight in the calendar you already use. You come back to a full day instead of a list of people to ring.</w:t>
+        <w:t>Viewings and valuations land straight in the calendar you already use. You come back to a full day instead of a list of people to ring.</w:t>
       </w:r>
     </w:p>
     <w:p>
       <w:pPr>
         <w:keepNext/>
-        <w:spacing w:after="40" w:before="150"/>
+        <w:spacing w:before="150" w:after="40"/>
       </w:pPr>
       <w:r>
         <w:rPr>
@@ -126,7 +116,7 @@
           <w:sz w:val="23"/>
           <w:szCs w:val="23"/>
         </w:rPr>
-        <w:t xml:space="preserve">Nobody on your team logs into anything.</w:t>
+        <w:t>Nobody on your team logs into anything.</w:t>
       </w:r>
     </w:p>
     <w:p>
@@ -135,17 +125,13 @@
         <w:ind w:left="28"/>
       </w:pPr>
       <w:r>
-        <w:rPr>
-          <w:sz w:val="22"/>
-          <w:szCs w:val="22"/>
-        </w:rPr>
-        <w:t xml:space="preserve">It all arrives in the inbox and the diary you already have. No new system for anyone to quietly ignore.</w:t>
+        <w:t>It all arrives in the inbox and the diary you already have. No new system for anyone to quietly ignore.</w:t>
       </w:r>
     </w:p>
     <w:p>
       <w:pPr>
         <w:keepNext/>
-        <w:spacing w:after="40" w:before="150"/>
+        <w:spacing w:before="150" w:after="40"/>
       </w:pPr>
       <w:r>
         <w:rPr>
@@ -154,7 +140,7 @@
           <w:sz w:val="23"/>
           <w:szCs w:val="23"/>
         </w:rPr>
-        <w:t xml:space="preserve">It knows what's under offer.</w:t>
+        <w:t>It knows what's under offer.</w:t>
       </w:r>
     </w:p>
     <w:p>
@@ -163,17 +149,13 @@
         <w:ind w:left="28"/>
       </w:pPr>
       <w:r>
-        <w:rPr>
-          <w:sz w:val="22"/>
-          <w:szCs w:val="22"/>
-        </w:rPr>
-        <w:t xml:space="preserve">Someone rings about Church Road, it knows that went Tuesday. It won't book a viewing on a house you can't show them.</w:t>
+        <w:t>Someone rings about Church Road, it knows that went Tuesday. It won't book a viewing on a house you can't show them.</w:t>
       </w:r>
     </w:p>
     <w:p>
       <w:pPr>
         <w:keepNext/>
-        <w:spacing w:after="40" w:before="150"/>
+        <w:spacing w:before="150" w:after="40"/>
       </w:pPr>
       <w:r>
         <w:rPr>
@@ -182,7 +164,7 @@
           <w:sz w:val="23"/>
           <w:szCs w:val="23"/>
         </w:rPr>
-        <w:t xml:space="preserve">Answered inside a minute, on every channel.</w:t>
+        <w:t>Answered inside a minute, on every channel.</w:t>
       </w:r>
     </w:p>
     <w:p>
@@ -191,17 +173,13 @@
         <w:ind w:left="28"/>
       </w:pPr>
       <w:r>
-        <w:rPr>
-          <w:sz w:val="22"/>
-          <w:szCs w:val="22"/>
-        </w:rPr>
-        <w:t xml:space="preserve">Phone, portal, website, email. Ten at night, Sunday morning, mid-viewing.</w:t>
+        <w:t>Phone, portal, website, email. Ten at night, Sunday morning, mid-viewing.</w:t>
       </w:r>
     </w:p>
     <w:p>
       <w:pPr>
         <w:keepNext/>
-        <w:spacing w:after="40" w:before="150"/>
+        <w:spacing w:before="150" w:after="40"/>
       </w:pPr>
       <w:r>
         <w:rPr>
@@ -210,7 +188,7 @@
           <w:sz w:val="23"/>
           <w:szCs w:val="23"/>
         </w:rPr>
-        <w:t xml:space="preserve">It chases twice.</w:t>
+        <w:t>It chases twice.</w:t>
       </w:r>
     </w:p>
     <w:p>
@@ -219,17 +197,13 @@
         <w:ind w:left="28"/>
       </w:pPr>
       <w:r>
-        <w:rPr>
-          <w:sz w:val="22"/>
-          <w:szCs w:val="22"/>
-        </w:rPr>
-        <w:t xml:space="preserve">Most enquiries die in the silence after the first message, not because you ignored them.</w:t>
+        <w:t>Most enquiries die in the silence after the first message, not because you ignored them.</w:t>
       </w:r>
     </w:p>
     <w:p>
       <w:pPr>
         <w:keepNext/>
-        <w:spacing w:after="40" w:before="150"/>
+        <w:spacing w:before="150" w:after="40"/>
       </w:pPr>
       <w:r>
         <w:rPr>
@@ -238,7 +212,7 @@
           <w:sz w:val="23"/>
           <w:szCs w:val="23"/>
         </w:rPr>
-        <w:t xml:space="preserve">A name on the first reply.</w:t>
+        <w:t>A name on the first reply.</w:t>
       </w:r>
     </w:p>
     <w:p>
@@ -247,17 +221,13 @@
         <w:ind w:left="28"/>
       </w:pPr>
       <w:r>
-        <w:rPr>
-          <w:sz w:val="22"/>
-          <w:szCs w:val="22"/>
-        </w:rPr>
-        <w:t xml:space="preserve">They know who's got it. That's how you get remembered against the other two agents they messaged that night.</w:t>
+        <w:t>They know who's got it. That's how you get remembered against the other two agents they messaged that night.</w:t>
       </w:r>
     </w:p>
     <w:p>
       <w:pPr>
         <w:keepNext/>
-        <w:spacing w:after="40" w:before="150"/>
+        <w:spacing w:before="150" w:after="40"/>
       </w:pPr>
       <w:r>
         <w:rPr>
@@ -266,7 +236,7 @@
           <w:sz w:val="23"/>
           <w:szCs w:val="23"/>
         </w:rPr>
-        <w:t xml:space="preserve">Your morning call list.</w:t>
+        <w:t>Your morning call list.</w:t>
       </w:r>
     </w:p>
     <w:p>
@@ -275,19 +245,15 @@
         <w:ind w:left="28"/>
       </w:pPr>
       <w:r>
-        <w:rPr>
-          <w:sz w:val="22"/>
-          <w:szCs w:val="22"/>
-        </w:rPr>
-        <w:t xml:space="preserve">A text when something books. A short list each evening of who's worth ringing.</w:t>
+        <w:t>A text when something books. A short list each evening of who's worth ringing.</w:t>
       </w:r>
     </w:p>
     <w:p>
       <w:pPr>
         <w:pBdr>
-          <w:bottom w:val="single" w:color="C8CDD4" w:sz="6" w:space="8"/>
+          <w:bottom w:val="single" w:sz="6" w:space="8" w:color="C8CDD4"/>
         </w:pBdr>
-        <w:spacing w:after="160" w:before="360"/>
+        <w:spacing w:before="360" w:after="160"/>
       </w:pPr>
       <w:r>
         <w:rPr>
@@ -297,7 +263,7 @@
           <w:sz w:val="24"/>
           <w:szCs w:val="24"/>
         </w:rPr>
-        <w:t xml:space="preserve">The guarantee</w:t>
+        <w:t>The guarantee</w:t>
       </w:r>
     </w:p>
     <w:p>
@@ -305,23 +271,12 @@
         <w:spacing w:after="120"/>
       </w:pPr>
       <w:r>
-        <w:rPr>
-          <w:sz w:val="22"/>
-          <w:szCs w:val="22"/>
-        </w:rPr>
-        <w:t xml:space="preserve">Every enquiry answered in 60 seconds, 24 hours a day. If one gets missed in your first month and I can't fix it, you get the month and the setup back.</w:t>
-      </w:r>
-    </w:p>
-    <w:p>
-      <w:pPr>
-        <w:spacing w:after="0"/>
-      </w:pPr>
-      <w:r>
-        <w:rPr>
-          <w:sz w:val="22"/>
-          <w:szCs w:val="22"/>
-        </w:rPr>
-        <w:t xml:space="preserve">300 voice minutes included, 25p a minute after. No contract, cancel whenever.</w:t>
+        <w:t>Every enquiry answered in 60 seconds, 24 hours a day. If one gets missed in your first month and I can't fix it, you get the month and the setup back.</w:t>
+      </w:r>
+    </w:p>
+    <w:p>
+      <w:r>
+        <w:t>300 voice minutes included, 25p a minute after. No contract, cancel whenever.</w:t>
       </w:r>
     </w:p>
     <w:p>
@@ -342,7 +297,8 @@
           <w:sz w:val="26"/>
           <w:szCs w:val="26"/>
         </w:rPr>
-        <w:t xml:space="preserve">NOVUS</w:t>
+        <w:lastRenderedPageBreak/>
+        <w:t>NOVUS</w:t>
       </w:r>
     </w:p>
     <w:p>
@@ -358,13 +314,13 @@
           <w:sz w:val="48"/>
           <w:szCs w:val="48"/>
         </w:rPr>
-        <w:t xml:space="preserve">Growth</w:t>
+        <w:t>Growth</w:t>
       </w:r>
     </w:p>
     <w:p>
       <w:pPr>
         <w:pBdr>
-          <w:bottom w:val="single" w:color="C8CDD4" w:sz="6" w:space="8"/>
+          <w:bottom w:val="single" w:sz="6" w:space="8" w:color="C8CDD4"/>
         </w:pBdr>
         <w:spacing w:after="260"/>
       </w:pPr>
@@ -374,12 +330,12 @@
           <w:sz w:val="24"/>
           <w:szCs w:val="24"/>
         </w:rPr>
-        <w:t xml:space="preserve">£599 a month.  No contract.  £1,200 to set up.</w:t>
-      </w:r>
-    </w:p>
-    <w:p>
-      <w:pPr>
-        <w:spacing w:after="240" w:before="200"/>
+        <w:t>£599 a month.  No contract.  £1,200 to set up.</w:t>
+      </w:r>
+    </w:p>
+    <w:p>
+      <w:pPr>
+        <w:spacing w:before="200" w:after="240"/>
       </w:pPr>
       <w:r>
         <w:rPr>
@@ -389,7 +345,7 @@
           <w:sz w:val="28"/>
           <w:szCs w:val="28"/>
         </w:rPr>
-        <w:t xml:space="preserve">Twelve extra market appraisals in ninety days, or you don't pay.</w:t>
+        <w:t>Twelve extra market appraisals in ninety days, or you don't pay.</w:t>
       </w:r>
     </w:p>
     <w:p>
@@ -400,22 +356,24 @@
         <w:rPr>
           <w:b/>
           <w:bCs/>
-          <w:sz w:val="22"/>
-          <w:szCs w:val="22"/>
         </w:rPr>
         <w:t xml:space="preserve">What it is: </w:t>
       </w:r>
       <w:r>
-        <w:rPr>
-          <w:sz w:val="22"/>
-          <w:szCs w:val="22"/>
-        </w:rPr>
-        <w:t xml:space="preserve">everything Core does, plus a second half. An assistant answering everything coming in — phone, portal, website, WhatsApp, text — trained on your listings and booking into your diary. And a second one working outwards: your old valuations, and anyone who's told you they've got a house to sell.</w:t>
-      </w:r>
-    </w:p>
-    <w:p>
-      <w:pPr>
-        <w:spacing w:after="200" w:before="320"/>
+        <w:t xml:space="preserve">everything Core does, plus a second half. An assistant answering everything coming in — phone, portal, website, WhatsApp, text — trained on your listings and booking into your diary. And a second one working </w:t>
+      </w:r>
+      <w:proofErr w:type="gramStart"/>
+      <w:r>
+        <w:t>outwards</w:t>
+      </w:r>
+      <w:proofErr w:type="gramEnd"/>
+      <w:r>
+        <w:t>: your old valuations, and anyone who's told you they've got a house to sell.</w:t>
+      </w:r>
+    </w:p>
+    <w:p>
+      <w:pPr>
+        <w:spacing w:before="320" w:after="200"/>
       </w:pPr>
       <w:r>
         <w:rPr>
@@ -425,13 +383,13 @@
           <w:sz w:val="26"/>
           <w:szCs w:val="26"/>
         </w:rPr>
-        <w:t xml:space="preserve">Half one — everything Core does</w:t>
+        <w:t>Half one — everything Core does</w:t>
       </w:r>
     </w:p>
     <w:p>
       <w:pPr>
         <w:keepNext/>
-        <w:spacing w:after="40" w:before="150"/>
+        <w:spacing w:before="150" w:after="40"/>
       </w:pPr>
       <w:r>
         <w:rPr>
@@ -440,7 +398,7 @@
           <w:sz w:val="23"/>
           <w:szCs w:val="23"/>
         </w:rPr>
-        <w:t xml:space="preserve">It books, it doesn't just reply.</w:t>
+        <w:t>It books, it doesn't just reply.</w:t>
       </w:r>
     </w:p>
     <w:p>
@@ -449,17 +407,13 @@
         <w:ind w:left="28"/>
       </w:pPr>
       <w:r>
-        <w:rPr>
-          <w:sz w:val="22"/>
-          <w:szCs w:val="22"/>
-        </w:rPr>
-        <w:t xml:space="preserve">Every enquiry answered inside a minute and put in your diary. Nights, Sundays, mid-viewing. It knows your stock, so it never sends anyone to a house that's gone.</w:t>
+        <w:t>Every enquiry answered inside a minute and put in your diary. Nights, Sundays, mid-viewing. It knows your stock, so it never sends anyone to a house that's gone.</w:t>
       </w:r>
     </w:p>
     <w:p>
       <w:pPr>
         <w:keepNext/>
-        <w:spacing w:after="40" w:before="150"/>
+        <w:spacing w:before="150" w:after="40"/>
       </w:pPr>
       <w:r>
         <w:rPr>
@@ -468,7 +422,7 @@
           <w:sz w:val="23"/>
           <w:szCs w:val="23"/>
         </w:rPr>
-        <w:t xml:space="preserve">It converts more of the same enquiries.</w:t>
+        <w:t>It converts more of the same enquiries.</w:t>
       </w:r>
     </w:p>
     <w:p>
@@ -477,17 +431,21 @@
         <w:ind w:left="28"/>
       </w:pPr>
       <w:r>
-        <w:rPr>
-          <w:sz w:val="22"/>
-          <w:szCs w:val="22"/>
-        </w:rPr>
-        <w:t xml:space="preserve">Two-way WhatsApp and text means a conversation, not a slot. They can't do Thursday. They've a question about the parking. That's where the extra bookings come from, with no extra leads.</w:t>
+        <w:t xml:space="preserve">Two-way WhatsApp and text </w:t>
+      </w:r>
+      <w:proofErr w:type="gramStart"/>
+      <w:r>
+        <w:t>means</w:t>
+      </w:r>
+      <w:proofErr w:type="gramEnd"/>
+      <w:r>
+        <w:t xml:space="preserve"> a conversation, not a slot. They can't do Thursday. They've a question about the parking. That's where the extra bookings come from, with no extra leads.</w:t>
       </w:r>
     </w:p>
     <w:p>
       <w:pPr>
         <w:keepNext/>
-        <w:spacing w:after="40" w:before="150"/>
+        <w:spacing w:before="150" w:after="40"/>
       </w:pPr>
       <w:r>
         <w:rPr>
@@ -496,7 +454,7 @@
           <w:sz w:val="23"/>
           <w:szCs w:val="23"/>
         </w:rPr>
-        <w:t xml:space="preserve">Buyers stay looked after past the sale.</w:t>
+        <w:t>Buyers stay looked after past the sale.</w:t>
       </w:r>
     </w:p>
     <w:p>
@@ -505,16 +463,12 @@
         <w:ind w:left="28"/>
       </w:pPr>
       <w:r>
-        <w:rPr>
-          <w:sz w:val="22"/>
-          <w:szCs w:val="22"/>
-        </w:rPr>
-        <w:t xml:space="preserve">The buyer you didn't drop this year is the one who rings you first when they sell.</w:t>
-      </w:r>
-    </w:p>
-    <w:p>
-      <w:pPr>
-        <w:spacing w:after="120" w:before="200"/>
+        <w:t>The buyer you didn't drop this year is the one who rings you first when they sell.</w:t>
+      </w:r>
+    </w:p>
+    <w:p>
+      <w:pPr>
+        <w:spacing w:before="200" w:after="120"/>
       </w:pPr>
       <w:r>
         <w:rPr>
@@ -524,12 +478,12 @@
           <w:sz w:val="21"/>
           <w:szCs w:val="21"/>
         </w:rPr>
-        <w:t xml:space="preserve">Worth saying: your team will log into this one. A WhatsApp thread can't be seen from an inbox.</w:t>
-      </w:r>
-    </w:p>
-    <w:p>
-      <w:pPr>
-        <w:spacing w:after="60" w:before="320"/>
+        <w:t>Worth saying: your team will log into this one. A WhatsApp thread can't be seen from an inbox.</w:t>
+      </w:r>
+    </w:p>
+    <w:p>
+      <w:pPr>
+        <w:spacing w:before="320" w:after="60"/>
       </w:pPr>
       <w:r>
         <w:rPr>
@@ -539,7 +493,7 @@
           <w:sz w:val="26"/>
           <w:szCs w:val="26"/>
         </w:rPr>
-        <w:t xml:space="preserve">Half two — the valuation list</w:t>
+        <w:t>Half two — the valuation list</w:t>
       </w:r>
     </w:p>
     <w:p>
@@ -554,13 +508,13 @@
           <w:sz w:val="21"/>
           <w:szCs w:val="21"/>
         </w:rPr>
-        <w:t xml:space="preserve">Someone whose only job is working it. Never out on a viewing, never stuck on a chain, never has a Tuesday where they didn't get round to it.</w:t>
+        <w:t>Someone whose only job is working it. Never out on a viewing, never stuck on a chain, never has a Tuesday where they didn't get round to it.</w:t>
       </w:r>
     </w:p>
     <w:p>
       <w:pPr>
         <w:keepNext/>
-        <w:spacing w:after="40" w:before="150"/>
+        <w:spacing w:before="150" w:after="40"/>
       </w:pPr>
       <w:r>
         <w:rPr>
@@ -569,7 +523,7 @@
           <w:sz w:val="23"/>
           <w:szCs w:val="23"/>
         </w:rPr>
-        <w:t xml:space="preserve">The 200 valuations you did and didn't win.</w:t>
+        <w:t>The 200 valuations you did and didn't win.</w:t>
       </w:r>
     </w:p>
     <w:p>
@@ -578,17 +532,23 @@
         <w:ind w:left="28"/>
       </w:pPr>
       <w:r>
-        <w:rPr>
-          <w:sz w:val="22"/>
-          <w:szCs w:val="22"/>
-        </w:rPr>
-        <w:t xml:space="preserve">Sat in your system, earning nothing. Most of those people never moved at all — they went quiet and nobody rang. Every one gets worked.</w:t>
+        <w:t xml:space="preserve">Sat in your system, earning nothing. Most of those people never moved at all — they went quiet and nobody rang. </w:t>
+      </w:r>
+      <w:proofErr w:type="spellStart"/>
+      <w:proofErr w:type="gramStart"/>
+      <w:r>
+        <w:t>Every one</w:t>
+      </w:r>
+      <w:proofErr w:type="spellEnd"/>
+      <w:proofErr w:type="gramEnd"/>
+      <w:r>
+        <w:t xml:space="preserve"> gets worked.</w:t>
       </w:r>
     </w:p>
     <w:p>
       <w:pPr>
         <w:keepNext/>
-        <w:spacing w:after="40" w:before="150"/>
+        <w:spacing w:before="150" w:after="40"/>
       </w:pPr>
       <w:r>
         <w:rPr>
@@ -597,7 +557,7 @@
           <w:sz w:val="23"/>
           <w:szCs w:val="23"/>
         </w:rPr>
-        <w:t xml:space="preserve">Your data, sorted by me.</w:t>
+        <w:t>Your data, sorted by me.</w:t>
       </w:r>
     </w:p>
     <w:p>
@@ -606,17 +566,21 @@
         <w:ind w:left="28"/>
       </w:pPr>
       <w:r>
-        <w:rPr>
-          <w:sz w:val="22"/>
-          <w:szCs w:val="22"/>
-        </w:rPr>
-        <w:t xml:space="preserve">You send the export. That's your involvement. You end the ninety days with a clean database whether or not you carry on.</w:t>
+        <w:t xml:space="preserve">You send the export. That's your involvement. You end the ninety days with a clean database </w:t>
+      </w:r>
+      <w:proofErr w:type="gramStart"/>
+      <w:r>
+        <w:t>whether or not</w:t>
+      </w:r>
+      <w:proofErr w:type="gramEnd"/>
+      <w:r>
+        <w:t xml:space="preserve"> you carry on.</w:t>
       </w:r>
     </w:p>
     <w:p>
       <w:pPr>
         <w:keepNext/>
-        <w:spacing w:after="40" w:before="150"/>
+        <w:spacing w:before="150" w:after="40"/>
       </w:pPr>
       <w:r>
         <w:rPr>
@@ -625,7 +589,7 @@
           <w:sz w:val="23"/>
           <w:szCs w:val="23"/>
         </w:rPr>
-        <w:t xml:space="preserve">Sellers taken all the way to the appointment.</w:t>
+        <w:t>Sellers taken all the way to the appointment.</w:t>
       </w:r>
     </w:p>
     <w:p>
@@ -634,17 +598,13 @@
         <w:ind w:left="28"/>
       </w:pPr>
       <w:r>
-        <w:rPr>
-          <w:sz w:val="22"/>
-          <w:szCs w:val="22"/>
-        </w:rPr>
-        <w:t xml:space="preserve">Right now, “I've got a place to sell” lands in an inbox and dies. Half of sellers get three agents round before choosing. Whoever's still politely in touch on day four is the one they remember.</w:t>
+        <w:t>Right now, “I've got a place to sell” lands in an inbox and dies. Half of sellers get three agents round before choosing. Whoever's still politely in touch on day four is the one they remember.</w:t>
       </w:r>
     </w:p>
     <w:p>
       <w:pPr>
         <w:keepNext/>
-        <w:spacing w:after="40" w:before="150"/>
+        <w:spacing w:before="150" w:after="40"/>
       </w:pPr>
       <w:r>
         <w:rPr>
@@ -653,7 +613,7 @@
           <w:sz w:val="23"/>
           <w:szCs w:val="23"/>
         </w:rPr>
-        <w:t xml:space="preserve">It doesn't stop after one message.</w:t>
+        <w:t>It doesn't stop after one message.</w:t>
       </w:r>
     </w:p>
     <w:p>
@@ -662,17 +622,13 @@
         <w:ind w:left="28"/>
       </w:pPr>
       <w:r>
-        <w:rPr>
-          <w:sz w:val="22"/>
-          <w:szCs w:val="22"/>
-        </w:rPr>
-        <w:t xml:space="preserve">They can reply three weeks later at eleven at night, ask about your fee, move a time, and get an answer in seconds.</w:t>
+        <w:t>They can reply three weeks later at eleven at night, ask about your fee, move a time, and get an answer in seconds.</w:t>
       </w:r>
     </w:p>
     <w:p>
       <w:pPr>
         <w:keepNext/>
-        <w:spacing w:after="40" w:before="150"/>
+        <w:spacing w:before="150" w:after="40"/>
       </w:pPr>
       <w:r>
         <w:rPr>
@@ -681,7 +637,7 @@
           <w:sz w:val="23"/>
           <w:szCs w:val="23"/>
         </w:rPr>
-        <w:t xml:space="preserve">The Friday page.</w:t>
+        <w:t>The Friday page.</w:t>
       </w:r>
     </w:p>
     <w:p>
@@ -690,17 +646,13 @@
         <w:ind w:left="28"/>
       </w:pPr>
       <w:r>
-        <w:rPr>
-          <w:sz w:val="22"/>
-          <w:szCs w:val="22"/>
-        </w:rPr>
-        <w:t xml:space="preserve">Appraisals booked, which list each came from, and how many people are still open. Most agents have never seen that last number.</w:t>
+        <w:t>Appraisals booked, which list each came from, and how many people are still open. Most agents have never seen that last number.</w:t>
       </w:r>
     </w:p>
     <w:p>
       <w:pPr>
         <w:keepNext/>
-        <w:spacing w:after="40" w:before="150"/>
+        <w:spacing w:before="150" w:after="40"/>
       </w:pPr>
       <w:r>
         <w:rPr>
@@ -709,7 +661,7 @@
           <w:sz w:val="23"/>
           <w:szCs w:val="23"/>
         </w:rPr>
-        <w:t xml:space="preserve">One trip instead of three.</w:t>
+        <w:t>One trip instead of three.</w:t>
       </w:r>
     </w:p>
     <w:p>
@@ -718,19 +670,15 @@
         <w:ind w:left="28"/>
       </w:pPr>
       <w:r>
-        <w:rPr>
-          <w:sz w:val="22"/>
-          <w:szCs w:val="22"/>
-        </w:rPr>
-        <w:t xml:space="preserve">A valuation and two viewings in the same patch get grouped together.</w:t>
+        <w:t>A valuation and two viewings in the same patch get grouped together.</w:t>
       </w:r>
     </w:p>
     <w:p>
       <w:pPr>
         <w:pBdr>
-          <w:bottom w:val="single" w:color="C8CDD4" w:sz="6" w:space="8"/>
+          <w:bottom w:val="single" w:sz="6" w:space="8" w:color="C8CDD4"/>
         </w:pBdr>
-        <w:spacing w:after="160" w:before="360"/>
+        <w:spacing w:before="360" w:after="160"/>
       </w:pPr>
       <w:r>
         <w:rPr>
@@ -740,7 +688,8 @@
           <w:sz w:val="24"/>
           <w:szCs w:val="24"/>
         </w:rPr>
-        <w:t xml:space="preserve">What it won't do</w:t>
+        <w:lastRenderedPageBreak/>
+        <w:t>What it won't do</w:t>
       </w:r>
     </w:p>
     <w:p>
@@ -748,11 +697,7 @@
         <w:spacing w:after="120"/>
       </w:pPr>
       <w:r>
-        <w:rPr>
-          <w:sz w:val="22"/>
-          <w:szCs w:val="22"/>
-        </w:rPr>
-        <w:t xml:space="preserve">It won't put a price on anyone's house. That's your job, on their sofa.</w:t>
+        <w:t>It won't put a price on anyone's house. That's your job, on their sofa.</w:t>
       </w:r>
     </w:p>
     <w:p>
@@ -760,11 +705,7 @@
         <w:spacing w:after="120"/>
       </w:pPr>
       <w:r>
-        <w:rPr>
-          <w:sz w:val="22"/>
-          <w:szCs w:val="22"/>
-        </w:rPr>
-        <w:t xml:space="preserve">It won't touch an offer, a chain, a complaint, or anything legal.</w:t>
+        <w:t>It won't touch an offer, a chain, a complaint, or anything legal.</w:t>
       </w:r>
     </w:p>
     <w:p>
@@ -772,11 +713,7 @@
         <w:spacing w:after="120"/>
       </w:pPr>
       <w:r>
-        <w:rPr>
-          <w:sz w:val="22"/>
-          <w:szCs w:val="22"/>
-        </w:rPr>
-        <w:t xml:space="preserve">It says what it is at the start of every call. It never pretends to be a person.</w:t>
+        <w:t>It says what it is at the start of every call. It never pretends to be a person.</w:t>
       </w:r>
     </w:p>
     <w:p>
@@ -784,11 +721,7 @@
         <w:spacing w:after="120"/>
       </w:pPr>
       <w:r>
-        <w:rPr>
-          <w:sz w:val="22"/>
-          <w:szCs w:val="22"/>
-        </w:rPr>
-        <w:t xml:space="preserve">It won't contact one name on that old list until we've checked you're allowed to.</w:t>
+        <w:t>It won't contact one name on that old list until we've checked you're allowed to.</w:t>
       </w:r>
     </w:p>
     <w:p>
@@ -796,19 +729,15 @@
         <w:spacing w:after="120"/>
       </w:pPr>
       <w:r>
-        <w:rPr>
-          <w:sz w:val="22"/>
-          <w:szCs w:val="22"/>
-        </w:rPr>
-        <w:t xml:space="preserve">You sign off exactly what it will and won't say, in writing, before it goes live. Then it runs forty scripted conversations before it takes a real one.</w:t>
+        <w:t>You sign off exactly what it will and won't say, in writing, before it goes live. Then it runs forty scripted conversations before it takes a real one.</w:t>
       </w:r>
     </w:p>
     <w:p>
       <w:pPr>
         <w:pBdr>
-          <w:bottom w:val="single" w:color="C8CDD4" w:sz="6" w:space="8"/>
+          <w:bottom w:val="single" w:sz="6" w:space="8" w:color="C8CDD4"/>
         </w:pBdr>
-        <w:spacing w:after="160" w:before="360"/>
+        <w:spacing w:before="360" w:after="160"/>
       </w:pPr>
       <w:r>
         <w:rPr>
@@ -818,7 +747,7 @@
           <w:sz w:val="24"/>
           <w:szCs w:val="24"/>
         </w:rPr>
-        <w:t xml:space="preserve">The guarantee</w:t>
+        <w:t>The guarantee</w:t>
       </w:r>
     </w:p>
     <w:p>
@@ -829,19 +758,11 @@
         <w:rPr>
           <w:b/>
           <w:bCs/>
-          <w:sz w:val="22"/>
-          <w:szCs w:val="22"/>
-        </w:rPr>
-        <w:t xml:space="preserve">Twelve extra market appraisals in ninety days</w:t>
-      </w:r>
-      <w:r>
-        <w:rPr>
-          <w:b w:val="false"/>
-          <w:bCs w:val="false"/>
-          <w:sz w:val="22"/>
-          <w:szCs w:val="22"/>
-        </w:rPr>
-        <w:t xml:space="preserve">, above whatever you average now. If it doesn't get there, you pick: all three months and the setup back, or I work free until it does.</w:t>
+        </w:rPr>
+        <w:t>Twelve extra market appraisals in ninety days</w:t>
+      </w:r>
+      <w:r>
+        <w:t>, above whatever you average now. If it doesn't get there, you pick: all three months and the setup back, or I work free until it does.</w:t>
       </w:r>
     </w:p>
     <w:p>
@@ -852,31 +773,24 @@
         <w:rPr>
           <w:b/>
           <w:bCs/>
-          <w:sz w:val="22"/>
-          <w:szCs w:val="22"/>
         </w:rPr>
         <w:t xml:space="preserve">And month six. </w:t>
       </w:r>
       <w:r>
-        <w:rPr>
-          <w:b w:val="false"/>
-          <w:bCs w:val="false"/>
-          <w:sz w:val="22"/>
-          <w:szCs w:val="22"/>
-        </w:rPr>
-        <w:t xml:space="preserve">That old list is finite — by month five it's mostly worked through. So if your second three months don't produce as many as your first three, I work free until they do. Everyone guarantees the launch. I'd rather commit to month six now than explain it to you later.</w:t>
-      </w:r>
-    </w:p>
-    <w:p>
-      <w:pPr>
-        <w:spacing w:after="0"/>
-      </w:pPr>
-      <w:r>
-        <w:rPr>
-          <w:sz w:val="22"/>
-          <w:szCs w:val="22"/>
-        </w:rPr>
-        <w:t xml:space="preserve">600 voice minutes included, 20p a minute after. No contract, cancel whenever.</w:t>
+        <w:t xml:space="preserve">That old list is finite — by month five it's mostly worked through. </w:t>
+      </w:r>
+      <w:proofErr w:type="gramStart"/>
+      <w:r>
+        <w:t>So</w:t>
+      </w:r>
+      <w:proofErr w:type="gramEnd"/>
+      <w:r>
+        <w:t xml:space="preserve"> if your second three months don't produce as many as your first three, I work free until they do. Everyone guarantees the launch. I'd rather commit to month six now than explain it to you later.</w:t>
+      </w:r>
+    </w:p>
+    <w:p>
+      <w:r>
+        <w:t>600 voice minutes included, 20p a minute after. No contract, cancel whenever.</w:t>
       </w:r>
     </w:p>
     <w:p>
@@ -891,7 +805,7 @@
           <w:sz w:val="20"/>
           <w:szCs w:val="20"/>
         </w:rPr>
-        <w:t xml:space="preserve">Built for independents, five or more years trading, with a database worth working. If that's not you yet I'll say so — the front desk on its own would still pay for itself, and I'd rather start you there.</w:t>
+        <w:t>Built for independents, five or more years trading, with a database worth working. If that's not you yet I'll say so — the front desk on its own would still pay for itself, and I'd rather start you there.</w:t>
       </w:r>
     </w:p>
     <w:p>
@@ -905,6 +819,7 @@
           <w:b/>
           <w:sz w:val="32"/>
         </w:rPr>
+        <w:lastRenderedPageBreak/>
         <w:t>NOVUS — Probe Grade &amp; Tier Routing</w:t>
       </w:r>
     </w:p>
@@ -915,18 +830,28 @@
     </w:p>
     <w:tbl>
       <w:tblPr>
-        <w:tblW w:type="auto" w:w="0"/>
-        <w:tblLook w:firstColumn="1" w:firstRow="1" w:lastColumn="0" w:lastRow="0" w:noHBand="0" w:noVBand="1" w:val="04A0"/>
+        <w:tblW w:w="0" w:type="auto"/>
+        <w:tblCellMar>
+          <w:left w:w="10" w:type="dxa"/>
+          <w:right w:w="10" w:type="dxa"/>
+        </w:tblCellMar>
+        <w:tblLook w:val="04A0" w:firstRow="1" w:lastRow="0" w:firstColumn="1" w:lastColumn="0" w:noHBand="0" w:noVBand="1"/>
       </w:tblPr>
       <w:tblGrid>
-        <w:gridCol w:w="3169"/>
+        <w:gridCol w:w="3168"/>
         <w:gridCol w:w="3169"/>
         <w:gridCol w:w="3169"/>
       </w:tblGrid>
       <w:tr>
-        <w:tc>
-          <w:tcPr>
-            <w:tcW w:type="dxa" w:w="3169"/>
+        <w:tblPrEx>
+          <w:tblCellMar>
+            <w:top w:w="0" w:type="dxa"/>
+            <w:bottom w:w="0" w:type="dxa"/>
+          </w:tblCellMar>
+        </w:tblPrEx>
+        <w:tc>
+          <w:tcPr>
+            <w:tcW w:w="3169" w:type="dxa"/>
           </w:tcPr>
           <w:p>
             <w:r>
@@ -936,7 +861,7 @@
         </w:tc>
         <w:tc>
           <w:tcPr>
-            <w:tcW w:type="dxa" w:w="3169"/>
+            <w:tcW w:w="3169" w:type="dxa"/>
           </w:tcPr>
           <w:p>
             <w:r>
@@ -946,7 +871,7 @@
         </w:tc>
         <w:tc>
           <w:tcPr>
-            <w:tcW w:type="dxa" w:w="3169"/>
+            <w:tcW w:w="3169" w:type="dxa"/>
           </w:tcPr>
           <w:p>
             <w:r>
@@ -956,9 +881,15 @@
         </w:tc>
       </w:tr>
       <w:tr>
-        <w:tc>
-          <w:tcPr>
-            <w:tcW w:type="dxa" w:w="3169"/>
+        <w:tblPrEx>
+          <w:tblCellMar>
+            <w:top w:w="0" w:type="dxa"/>
+            <w:bottom w:w="0" w:type="dxa"/>
+          </w:tblCellMar>
+        </w:tblPrEx>
+        <w:tc>
+          <w:tcPr>
+            <w:tcW w:w="3169" w:type="dxa"/>
           </w:tcPr>
           <w:p>
             <w:r>
@@ -968,7 +899,7 @@
         </w:tc>
         <w:tc>
           <w:tcPr>
-            <w:tcW w:type="dxa" w:w="3169"/>
+            <w:tcW w:w="3169" w:type="dxa"/>
           </w:tcPr>
           <w:p>
             <w:r>
@@ -978,7 +909,7 @@
         </w:tc>
         <w:tc>
           <w:tcPr>
-            <w:tcW w:type="dxa" w:w="3169"/>
+            <w:tcW w:w="3169" w:type="dxa"/>
           </w:tcPr>
           <w:p>
             <w:r>
@@ -988,9 +919,15 @@
         </w:tc>
       </w:tr>
       <w:tr>
-        <w:tc>
-          <w:tcPr>
-            <w:tcW w:type="dxa" w:w="3169"/>
+        <w:tblPrEx>
+          <w:tblCellMar>
+            <w:top w:w="0" w:type="dxa"/>
+            <w:bottom w:w="0" w:type="dxa"/>
+          </w:tblCellMar>
+        </w:tblPrEx>
+        <w:tc>
+          <w:tcPr>
+            <w:tcW w:w="3169" w:type="dxa"/>
           </w:tcPr>
           <w:p>
             <w:r>
@@ -1000,7 +937,7 @@
         </w:tc>
         <w:tc>
           <w:tcPr>
-            <w:tcW w:type="dxa" w:w="3169"/>
+            <w:tcW w:w="3169" w:type="dxa"/>
           </w:tcPr>
           <w:p>
             <w:r>
@@ -1010,7 +947,7 @@
         </w:tc>
         <w:tc>
           <w:tcPr>
-            <w:tcW w:type="dxa" w:w="3169"/>
+            <w:tcW w:w="3169" w:type="dxa"/>
           </w:tcPr>
           <w:p>
             <w:r>
@@ -1020,9 +957,15 @@
         </w:tc>
       </w:tr>
       <w:tr>
-        <w:tc>
-          <w:tcPr>
-            <w:tcW w:type="dxa" w:w="3169"/>
+        <w:tblPrEx>
+          <w:tblCellMar>
+            <w:top w:w="0" w:type="dxa"/>
+            <w:bottom w:w="0" w:type="dxa"/>
+          </w:tblCellMar>
+        </w:tblPrEx>
+        <w:tc>
+          <w:tcPr>
+            <w:tcW w:w="3169" w:type="dxa"/>
           </w:tcPr>
           <w:p>
             <w:r>
@@ -1032,17 +975,22 @@
         </w:tc>
         <w:tc>
           <w:tcPr>
-            <w:tcW w:type="dxa" w:w="3169"/>
-          </w:tcPr>
-          <w:p>
-            <w:r>
-              <w:t>Very Fast + Non-Persistent</w:t>
-            </w:r>
-          </w:p>
-        </w:tc>
-        <w:tc>
-          <w:tcPr>
-            <w:tcW w:type="dxa" w:w="3169"/>
+            <w:tcW w:w="3169" w:type="dxa"/>
+          </w:tcPr>
+          <w:p>
+            <w:r>
+              <w:t xml:space="preserve">Very Fast + </w:t>
+            </w:r>
+            <w:proofErr w:type="gramStart"/>
+            <w:r>
+              <w:t>Non-Persistent</w:t>
+            </w:r>
+            <w:proofErr w:type="gramEnd"/>
+          </w:p>
+        </w:tc>
+        <w:tc>
+          <w:tcPr>
+            <w:tcW w:w="3169" w:type="dxa"/>
           </w:tcPr>
           <w:p>
             <w:r>
@@ -1052,9 +1000,15 @@
         </w:tc>
       </w:tr>
       <w:tr>
-        <w:tc>
-          <w:tcPr>
-            <w:tcW w:type="dxa" w:w="3169"/>
+        <w:tblPrEx>
+          <w:tblCellMar>
+            <w:top w:w="0" w:type="dxa"/>
+            <w:bottom w:w="0" w:type="dxa"/>
+          </w:tblCellMar>
+        </w:tblPrEx>
+        <w:tc>
+          <w:tcPr>
+            <w:tcW w:w="3169" w:type="dxa"/>
           </w:tcPr>
           <w:p>
             <w:r>
@@ -1064,17 +1018,22 @@
         </w:tc>
         <w:tc>
           <w:tcPr>
-            <w:tcW w:type="dxa" w:w="3169"/>
-          </w:tcPr>
-          <w:p>
-            <w:r>
-              <w:t>Fast + Non-Persistent</w:t>
-            </w:r>
-          </w:p>
-        </w:tc>
-        <w:tc>
-          <w:tcPr>
-            <w:tcW w:type="dxa" w:w="3169"/>
+            <w:tcW w:w="3169" w:type="dxa"/>
+          </w:tcPr>
+          <w:p>
+            <w:r>
+              <w:t xml:space="preserve">Fast + </w:t>
+            </w:r>
+            <w:proofErr w:type="gramStart"/>
+            <w:r>
+              <w:t>Non-Persistent</w:t>
+            </w:r>
+            <w:proofErr w:type="gramEnd"/>
+          </w:p>
+        </w:tc>
+        <w:tc>
+          <w:tcPr>
+            <w:tcW w:w="3169" w:type="dxa"/>
           </w:tcPr>
           <w:p>
             <w:r>
@@ -1084,9 +1043,15 @@
         </w:tc>
       </w:tr>
       <w:tr>
-        <w:tc>
-          <w:tcPr>
-            <w:tcW w:type="dxa" w:w="3169"/>
+        <w:tblPrEx>
+          <w:tblCellMar>
+            <w:top w:w="0" w:type="dxa"/>
+            <w:bottom w:w="0" w:type="dxa"/>
+          </w:tblCellMar>
+        </w:tblPrEx>
+        <w:tc>
+          <w:tcPr>
+            <w:tcW w:w="3169" w:type="dxa"/>
           </w:tcPr>
           <w:p>
             <w:r>
@@ -1096,7 +1061,7 @@
         </w:tc>
         <w:tc>
           <w:tcPr>
-            <w:tcW w:type="dxa" w:w="3169"/>
+            <w:tcW w:w="3169" w:type="dxa"/>
           </w:tcPr>
           <w:p>
             <w:r>
@@ -1106,7 +1071,7 @@
         </w:tc>
         <w:tc>
           <w:tcPr>
-            <w:tcW w:type="dxa" w:w="3169"/>
+            <w:tcW w:w="3169" w:type="dxa"/>
           </w:tcPr>
           <w:p>
             <w:r>
@@ -1116,9 +1081,15 @@
         </w:tc>
       </w:tr>
       <w:tr>
-        <w:tc>
-          <w:tcPr>
-            <w:tcW w:type="dxa" w:w="3169"/>
+        <w:tblPrEx>
+          <w:tblCellMar>
+            <w:top w:w="0" w:type="dxa"/>
+            <w:bottom w:w="0" w:type="dxa"/>
+          </w:tblCellMar>
+        </w:tblPrEx>
+        <w:tc>
+          <w:tcPr>
+            <w:tcW w:w="3169" w:type="dxa"/>
           </w:tcPr>
           <w:p>
             <w:r>
@@ -1128,17 +1099,22 @@
         </w:tc>
         <w:tc>
           <w:tcPr>
-            <w:tcW w:type="dxa" w:w="3169"/>
-          </w:tcPr>
-          <w:p>
-            <w:r>
-              <w:t>Slow + Non-Persistent</w:t>
-            </w:r>
-          </w:p>
-        </w:tc>
-        <w:tc>
-          <w:tcPr>
-            <w:tcW w:type="dxa" w:w="3169"/>
+            <w:tcW w:w="3169" w:type="dxa"/>
+          </w:tcPr>
+          <w:p>
+            <w:r>
+              <w:t xml:space="preserve">Slow + </w:t>
+            </w:r>
+            <w:proofErr w:type="gramStart"/>
+            <w:r>
+              <w:t>Non-Persistent</w:t>
+            </w:r>
+            <w:proofErr w:type="gramEnd"/>
+          </w:p>
+        </w:tc>
+        <w:tc>
+          <w:tcPr>
+            <w:tcW w:w="3169" w:type="dxa"/>
           </w:tcPr>
           <w:p>
             <w:r>
@@ -1148,9 +1124,15 @@
         </w:tc>
       </w:tr>
       <w:tr>
-        <w:tc>
-          <w:tcPr>
-            <w:tcW w:type="dxa" w:w="3169"/>
+        <w:tblPrEx>
+          <w:tblCellMar>
+            <w:top w:w="0" w:type="dxa"/>
+            <w:bottom w:w="0" w:type="dxa"/>
+          </w:tblCellMar>
+        </w:tblPrEx>
+        <w:tc>
+          <w:tcPr>
+            <w:tcW w:w="3169" w:type="dxa"/>
           </w:tcPr>
           <w:p>
             <w:r>
@@ -1160,7 +1142,7 @@
         </w:tc>
         <w:tc>
           <w:tcPr>
-            <w:tcW w:type="dxa" w:w="3169"/>
+            <w:tcW w:w="3169" w:type="dxa"/>
           </w:tcPr>
           <w:p>
             <w:r>
@@ -1170,7 +1152,7 @@
         </w:tc>
         <w:tc>
           <w:tcPr>
-            <w:tcW w:type="dxa" w:w="3169"/>
+            <w:tcW w:w="3169" w:type="dxa"/>
           </w:tcPr>
           <w:p>
             <w:r>
@@ -1180,9 +1162,15 @@
         </w:tc>
       </w:tr>
       <w:tr>
-        <w:tc>
-          <w:tcPr>
-            <w:tcW w:type="dxa" w:w="3169"/>
+        <w:tblPrEx>
+          <w:tblCellMar>
+            <w:top w:w="0" w:type="dxa"/>
+            <w:bottom w:w="0" w:type="dxa"/>
+          </w:tblCellMar>
+        </w:tblPrEx>
+        <w:tc>
+          <w:tcPr>
+            <w:tcW w:w="3169" w:type="dxa"/>
           </w:tcPr>
           <w:p>
             <w:r>
@@ -1192,7 +1180,7 @@
         </w:tc>
         <w:tc>
           <w:tcPr>
-            <w:tcW w:type="dxa" w:w="3169"/>
+            <w:tcW w:w="3169" w:type="dxa"/>
           </w:tcPr>
           <w:p>
             <w:r>
@@ -1202,11 +1190,17 @@
         </w:tc>
         <w:tc>
           <w:tcPr>
-            <w:tcW w:type="dxa" w:w="3169"/>
-          </w:tcPr>
-          <w:p>
-            <w:r>
-              <w:t>No meaningful response on any channel after 7 days.</w:t>
+            <w:tcW w:w="3169" w:type="dxa"/>
+          </w:tcPr>
+          <w:p>
+            <w:r>
+              <w:t xml:space="preserve">No meaningful response on any channel after </w:t>
+            </w:r>
+            <w:r>
+              <w:t>4</w:t>
+            </w:r>
+            <w:r>
+              <w:t xml:space="preserve"> days.</w:t>
             </w:r>
           </w:p>
         </w:tc>
@@ -1249,98 +1243,22 @@
       </w:r>
     </w:p>
     <w:sectPr>
-      <w:pgSz w:w="11906" w:h="16838" w:orient="portrait"/>
+      <w:pgSz w:w="11906" w:h="16838"/>
       <w:pgMar w:top="1100" w:right="1200" w:bottom="1000" w:left="1200" w:header="708" w:footer="708" w:gutter="0"/>
-      <w:pgNumType/>
+      <w:cols w:space="720"/>
       <w:docGrid w:linePitch="360"/>
     </w:sectPr>
   </w:body>
 </w:document>
 </file>
 
-<file path=word/comments.xml><?xml version="1.0" encoding="utf-8"?>
-<w:comments xmlns:cx="http://schemas.microsoft.com/office/drawing/2014/chartex" xmlns:cx1="http://schemas.microsoft.com/office/drawing/2015/9/8/chartex" xmlns:cx2="http://schemas.microsoft.com/office/drawing/2015/10/21/chartex" xmlns:cx3="http://schemas.microsoft.com/office/drawing/2016/5/9/chartex" xmlns:cx4="http://schemas.microsoft.com/office/drawing/2016/5/10/chartex" xmlns:cx5="http://schemas.microsoft.com/office/drawing/2016/5/11/chartex" xmlns:cx6="http://schemas.microsoft.com/office/drawing/2016/5/12/chartex" xmlns:cx7="http://schemas.microsoft.com/office/drawing/2016/5/13/chartex" xmlns:cx8="http://schemas.microsoft.com/office/drawing/2016/5/14/chartex" xmlns:mc="http://schemas.openxmlformats.org/markup-compatibility/2006" xmlns:aink="http://schemas.microsoft.com/office/drawing/2016/ink" xmlns:am3d="http://schemas.microsoft.com/office/drawing/2017/model3d" xmlns:o="urn:schemas-microsoft-com:office:office" xmlns:r="http://schemas.openxmlformats.org/officeDocument/2006/relationships" xmlns:m="http://schemas.openxmlformats.org/officeDocument/2006/math" xmlns:v="urn:schemas-microsoft-com:vml" xmlns:wp14="http://schemas.microsoft.com/office/word/2010/wordprocessingDrawing" xmlns:wp="http://schemas.openxmlformats.org/drawingml/2006/wordprocessingDrawing" xmlns:w10="urn:schemas-microsoft-com:office:word" xmlns:w="http://schemas.openxmlformats.org/wordprocessingml/2006/main" xmlns:w14="http://schemas.microsoft.com/office/word/2010/wordml" xmlns:w15="http://schemas.microsoft.com/office/word/2012/wordml" xmlns:w16cex="http://schemas.microsoft.com/office/word/2018/wordml/cex" xmlns:w16cid="http://schemas.microsoft.com/office/word/2016/wordml/cid" xmlns:w16="http://schemas.microsoft.com/office/word/2018/wordml" xmlns:w16sdtdh="http://schemas.microsoft.com/office/word/2020/wordml/sdtdatahash" xmlns:w16se="http://schemas.microsoft.com/office/word/2015/wordml/symex" xmlns:wpg="http://schemas.microsoft.com/office/word/2010/wordprocessingGroup" xmlns:wpi="http://schemas.microsoft.com/office/word/2010/wordprocessingInk" xmlns:wne="http://schemas.microsoft.com/office/word/2006/wordml" xmlns:wps="http://schemas.microsoft.com/office/word/2010/wordprocessingShape"/>
-</file>
-
-<file path=word/endnotes.xml><?xml version="1.0" encoding="utf-8"?>
-<w:endnotes xmlns:wpc="http://schemas.microsoft.com/office/word/2010/wordprocessingCanvas" xmlns:mc="http://schemas.openxmlformats.org/markup-compatibility/2006" xmlns:o="urn:schemas-microsoft-com:office:office" xmlns:r="http://schemas.openxmlformats.org/officeDocument/2006/relationships" xmlns:m="http://schemas.openxmlformats.org/officeDocument/2006/math" xmlns:v="urn:schemas-microsoft-com:vml" xmlns:wp14="http://schemas.microsoft.com/office/word/2010/wordprocessingDrawing" xmlns:wp="http://schemas.openxmlformats.org/drawingml/2006/wordprocessingDrawing" xmlns:w10="urn:schemas-microsoft-com:office:word" xmlns:w="http://schemas.openxmlformats.org/wordprocessingml/2006/main" xmlns:w14="http://schemas.microsoft.com/office/word/2010/wordml" xmlns:w15="http://schemas.microsoft.com/office/word/2012/wordml" xmlns:wpg="http://schemas.microsoft.com/office/word/2010/wordprocessingGroup" xmlns:wpi="http://schemas.microsoft.com/office/word/2010/wordprocessingInk" xmlns:wne="http://schemas.microsoft.com/office/word/2006/wordml" xmlns:wps="http://schemas.microsoft.com/office/word/2010/wordprocessingShape" mc:Ignorable="w14 w15 wp14">
-  <w:endnote w:type="separator" w:id="-1">
-    <w:p>
-      <w:pPr>
-        <w:spacing w:after="0" w:line="240" w:lineRule="auto"/>
-      </w:pPr>
-      <w:r>
-        <w:rPr>
-          <w:rStyle w:val="EndnoteReference"/>
-        </w:rPr>
-        <w:endnoteRef/>
-      </w:r>
-      <w:r>
-        <w:separator/>
-      </w:r>
-    </w:p>
-  </w:endnote>
-  <w:endnote w:type="continuationSeparator" w:id="0">
-    <w:p>
-      <w:pPr>
-        <w:spacing w:after="0" w:line="240" w:lineRule="auto"/>
-      </w:pPr>
-      <w:r>
-        <w:rPr>
-          <w:rStyle w:val="EndnoteReference"/>
-        </w:rPr>
-        <w:endnoteRef/>
-      </w:r>
-      <w:r>
-        <w:continuationSeparator/>
-      </w:r>
-    </w:p>
-  </w:endnote>
-</w:endnotes>
-</file>
-
-<file path=word/footnotes.xml><?xml version="1.0" encoding="utf-8"?>
-<w:footnotes xmlns:wpc="http://schemas.microsoft.com/office/word/2010/wordprocessingCanvas" xmlns:mc="http://schemas.openxmlformats.org/markup-compatibility/2006" xmlns:o="urn:schemas-microsoft-com:office:office" xmlns:r="http://schemas.openxmlformats.org/officeDocument/2006/relationships" xmlns:m="http://schemas.openxmlformats.org/officeDocument/2006/math" xmlns:v="urn:schemas-microsoft-com:vml" xmlns:wp14="http://schemas.microsoft.com/office/word/2010/wordprocessingDrawing" xmlns:wp="http://schemas.openxmlformats.org/drawingml/2006/wordprocessingDrawing" xmlns:w10="urn:schemas-microsoft-com:office:word" xmlns:w="http://schemas.openxmlformats.org/wordprocessingml/2006/main" xmlns:w14="http://schemas.microsoft.com/office/word/2010/wordml" xmlns:w15="http://schemas.microsoft.com/office/word/2012/wordml" xmlns:wpg="http://schemas.microsoft.com/office/word/2010/wordprocessingGroup" xmlns:wpi="http://schemas.microsoft.com/office/word/2010/wordprocessingInk" xmlns:wne="http://schemas.microsoft.com/office/word/2006/wordml" xmlns:wps="http://schemas.microsoft.com/office/word/2010/wordprocessingShape" mc:Ignorable="w14 w15 wp14">
-  <w:footnote w:type="separator" w:id="-1">
-    <w:p>
-      <w:pPr>
-        <w:spacing w:after="0" w:line="240" w:lineRule="auto"/>
-      </w:pPr>
-      <w:r>
-        <w:rPr>
-          <w:rStyle w:val="FootnoteReference"/>
-        </w:rPr>
-        <w:footnoteRef/>
-      </w:r>
-      <w:r>
-        <w:separator/>
-      </w:r>
-    </w:p>
-  </w:footnote>
-  <w:footnote w:type="continuationSeparator" w:id="0">
-    <w:p>
-      <w:pPr>
-        <w:spacing w:after="0" w:line="240" w:lineRule="auto"/>
-      </w:pPr>
-      <w:r>
-        <w:rPr>
-          <w:rStyle w:val="FootnoteReference"/>
-        </w:rPr>
-        <w:footnoteRef/>
-      </w:r>
-      <w:r>
-        <w:continuationSeparator/>
-      </w:r>
-    </w:p>
-  </w:footnote>
-</w:footnotes>
-</file>
-
 <file path=word/numbering.xml><?xml version="1.0" encoding="utf-8"?>
-<w:numbering xmlns:wpc="http://schemas.microsoft.com/office/word/2010/wordprocessingCanvas" xmlns:mc="http://schemas.openxmlformats.org/markup-compatibility/2006" xmlns:o="urn:schemas-microsoft-com:office:office" xmlns:r="http://schemas.openxmlformats.org/officeDocument/2006/relationships" xmlns:m="http://schemas.openxmlformats.org/officeDocument/2006/math" xmlns:v="urn:schemas-microsoft-com:vml" xmlns:wp14="http://schemas.microsoft.com/office/word/2010/wordprocessingDrawing" xmlns:wp="http://schemas.openxmlformats.org/drawingml/2006/wordprocessingDrawing" xmlns:w10="urn:schemas-microsoft-com:office:word" xmlns:w="http://schemas.openxmlformats.org/wordprocessingml/2006/main" xmlns:w14="http://schemas.microsoft.com/office/word/2010/wordml" xmlns:w15="http://schemas.microsoft.com/office/word/2012/wordml" xmlns:wpg="http://schemas.microsoft.com/office/word/2010/wordprocessingGroup" xmlns:wpi="http://schemas.microsoft.com/office/word/2010/wordprocessingInk" xmlns:wne="http://schemas.microsoft.com/office/word/2006/wordml" xmlns:wps="http://schemas.microsoft.com/office/word/2010/wordprocessingShape" mc:Ignorable="w14 w15 wp14">
-  <w:abstractNum w:abstractNumId="1" w15:restartNumberingAfterBreak="0">
+<w:numbering xmlns:wpc="http://schemas.microsoft.com/office/word/2010/wordprocessingCanvas" xmlns:cx="http://schemas.microsoft.com/office/drawing/2014/chartex" xmlns:cx1="http://schemas.microsoft.com/office/drawing/2015/9/8/chartex" xmlns:cx2="http://schemas.microsoft.com/office/drawing/2015/10/21/chartex" xmlns:cx3="http://schemas.microsoft.com/office/drawing/2016/5/9/chartex" xmlns:cx4="http://schemas.microsoft.com/office/drawing/2016/5/10/chartex" xmlns:cx5="http://schemas.microsoft.com/office/drawing/2016/5/11/chartex" xmlns:cx6="http://schemas.microsoft.com/office/drawing/2016/5/12/chartex" xmlns:cx7="http://schemas.microsoft.com/office/drawing/2016/5/13/chartex" xmlns:cx8="http://schemas.microsoft.com/office/drawing/2016/5/14/chartex" xmlns:mc="http://schemas.openxmlformats.org/markup-compatibility/2006" xmlns:aink="http://schemas.microsoft.com/office/drawing/2016/ink" xmlns:am3d="http://schemas.microsoft.com/office/drawing/2017/model3d" xmlns:o="urn:schemas-microsoft-com:office:office" xmlns:oel="http://schemas.microsoft.com/office/2019/extlst" xmlns:r="http://schemas.openxmlformats.org/officeDocument/2006/relationships" xmlns:m="http://schemas.openxmlformats.org/officeDocument/2006/math" xmlns:v="urn:schemas-microsoft-com:vml" xmlns:wp14="http://schemas.microsoft.com/office/word/2010/wordprocessingDrawing" xmlns:wp="http://schemas.openxmlformats.org/drawingml/2006/wordprocessingDrawing" xmlns:w10="urn:schemas-microsoft-com:office:word" xmlns:w="http://schemas.openxmlformats.org/wordprocessingml/2006/main" xmlns:w14="http://schemas.microsoft.com/office/word/2010/wordml" xmlns:w15="http://schemas.microsoft.com/office/word/2012/wordml" xmlns:w16cei="http://schemas.microsoft.com/office/word/2026/wordml/cei" xmlns:w16cex="http://schemas.microsoft.com/office/word/2018/wordml/cex" xmlns:w16cid="http://schemas.microsoft.com/office/word/2016/wordml/cid" xmlns:w16="http://schemas.microsoft.com/office/word/2018/wordml" xmlns:w16du="http://schemas.microsoft.com/office/word/2023/wordml/word16du" xmlns:w16sdtdh="http://schemas.microsoft.com/office/word/2020/wordml/sdtdatahash" xmlns:w16sdtfl="http://schemas.microsoft.com/office/word/2024/wordml/sdtformatlock" xmlns:w16se="http://schemas.microsoft.com/office/word/2015/wordml/symex" xmlns:wpg="http://schemas.microsoft.com/office/word/2010/wordprocessingGroup" xmlns:wpi="http://schemas.microsoft.com/office/word/2010/wordprocessingInk" xmlns:wne="http://schemas.microsoft.com/office/word/2006/wordml" xmlns:wps="http://schemas.microsoft.com/office/word/2010/wordprocessingShape" mc:Ignorable="w14 w15 w16se w16cid w16 w16cex w16sdtdh w16sdtfl w16du wp14">
+  <w:abstractNum w:abstractNumId="0" w15:restartNumberingAfterBreak="0">
+    <w:nsid w:val="13863301"/>
     <w:multiLevelType w:val="hybridMultilevel"/>
-    <w:lvl w:ilvl="0" w15:tentative="1">
+    <w:tmpl w:val="B748FAE8"/>
+    <w:lvl w:ilvl="0" w:tplc="636A439C">
       <w:start w:val="1"/>
       <w:numFmt w:val="bullet"/>
       <w:lvlText w:val="●"/>
@@ -1349,7 +1267,7 @@
         <w:ind w:left="720" w:hanging="360"/>
       </w:pPr>
     </w:lvl>
-    <w:lvl w:ilvl="1" w15:tentative="1">
+    <w:lvl w:ilvl="1" w:tplc="1DE40160">
       <w:start w:val="1"/>
       <w:numFmt w:val="bullet"/>
       <w:lvlText w:val="○"/>
@@ -1358,7 +1276,7 @@
         <w:ind w:left="1440" w:hanging="360"/>
       </w:pPr>
     </w:lvl>
-    <w:lvl w:ilvl="2" w15:tentative="1">
+    <w:lvl w:ilvl="2" w:tplc="0D6641AA">
       <w:start w:val="1"/>
       <w:numFmt w:val="bullet"/>
       <w:lvlText w:val="■"/>
@@ -1367,7 +1285,7 @@
         <w:ind w:left="2160" w:hanging="360"/>
       </w:pPr>
     </w:lvl>
-    <w:lvl w:ilvl="3" w15:tentative="1">
+    <w:lvl w:ilvl="3" w:tplc="ABFA3D98">
       <w:start w:val="1"/>
       <w:numFmt w:val="bullet"/>
       <w:lvlText w:val="●"/>
@@ -1376,7 +1294,7 @@
         <w:ind w:left="2880" w:hanging="360"/>
       </w:pPr>
     </w:lvl>
-    <w:lvl w:ilvl="4" w15:tentative="1">
+    <w:lvl w:ilvl="4" w:tplc="4CB2BE76">
       <w:start w:val="1"/>
       <w:numFmt w:val="bullet"/>
       <w:lvlText w:val="○"/>
@@ -1385,7 +1303,7 @@
         <w:ind w:left="3600" w:hanging="360"/>
       </w:pPr>
     </w:lvl>
-    <w:lvl w:ilvl="5" w15:tentative="1">
+    <w:lvl w:ilvl="5" w:tplc="48402CF0">
       <w:start w:val="1"/>
       <w:numFmt w:val="bullet"/>
       <w:lvlText w:val="■"/>
@@ -1394,7 +1312,7 @@
         <w:ind w:left="4320" w:hanging="360"/>
       </w:pPr>
     </w:lvl>
-    <w:lvl w:ilvl="6" w15:tentative="1">
+    <w:lvl w:ilvl="6" w:tplc="6AC0B24A">
       <w:start w:val="1"/>
       <w:numFmt w:val="bullet"/>
       <w:lvlText w:val="●"/>
@@ -1403,7 +1321,7 @@
         <w:ind w:left="5040" w:hanging="360"/>
       </w:pPr>
     </w:lvl>
-    <w:lvl w:ilvl="7" w15:tentative="1">
+    <w:lvl w:ilvl="7" w:tplc="3F5C240C">
       <w:start w:val="1"/>
       <w:numFmt w:val="bullet"/>
       <w:lvlText w:val="●"/>
@@ -1412,7 +1330,7 @@
         <w:ind w:left="5760" w:hanging="360"/>
       </w:pPr>
     </w:lvl>
-    <w:lvl w:ilvl="8" w15:tentative="1">
+    <w:lvl w:ilvl="8" w:tplc="5AFCDD68">
       <w:start w:val="1"/>
       <w:numFmt w:val="bullet"/>
       <w:lvlText w:val="●"/>
@@ -1422,8 +1340,8 @@
       </w:pPr>
     </w:lvl>
   </w:abstractNum>
-  <w:num w:numId="1">
-    <w:abstractNumId w:val="1"/>
+  <w:num w:numId="1" w16cid:durableId="1097016699">
+    <w:abstractNumId w:val="0"/>
     <w:lvlOverride w:ilvl="0">
       <w:startOverride w:val="1"/>
     </w:lvlOverride>
@@ -1432,33 +1350,408 @@
 </file>
 
 <file path=word/styles.xml><?xml version="1.0" encoding="utf-8"?>
-<w:styles xmlns:mc="http://schemas.openxmlformats.org/markup-compatibility/2006" xmlns:r="http://schemas.openxmlformats.org/officeDocument/2006/relationships" xmlns:w="http://schemas.openxmlformats.org/wordprocessingml/2006/main" xmlns:w14="http://schemas.microsoft.com/office/word/2010/wordml" xmlns:w15="http://schemas.microsoft.com/office/word/2012/wordml" mc:Ignorable="w14 w15">
+<w:styles xmlns:mc="http://schemas.openxmlformats.org/markup-compatibility/2006" xmlns:r="http://schemas.openxmlformats.org/officeDocument/2006/relationships" xmlns:w="http://schemas.openxmlformats.org/wordprocessingml/2006/main" xmlns:w14="http://schemas.microsoft.com/office/word/2010/wordml" xmlns:w15="http://schemas.microsoft.com/office/word/2012/wordml" xmlns:w16cex="http://schemas.microsoft.com/office/word/2018/wordml/cex" xmlns:w16cid="http://schemas.microsoft.com/office/word/2016/wordml/cid" xmlns:w16="http://schemas.microsoft.com/office/word/2018/wordml" xmlns:w16du="http://schemas.microsoft.com/office/word/2023/wordml/word16du" xmlns:w16sdtdh="http://schemas.microsoft.com/office/word/2020/wordml/sdtdatahash" xmlns:w16sdtfl="http://schemas.microsoft.com/office/word/2024/wordml/sdtformatlock" xmlns:w16se="http://schemas.microsoft.com/office/word/2015/wordml/symex" mc:Ignorable="w14 w15 w16se w16cid w16 w16cex w16sdtdh w16sdtfl w16du">
   <w:docDefaults>
     <w:rPrDefault>
       <w:rPr>
-        <w:rFonts w:ascii="Calibri" w:cs="Calibri" w:eastAsia="Calibri" w:hAnsi="Calibri"/>
+        <w:rFonts w:ascii="Calibri" w:eastAsia="Calibri" w:hAnsi="Calibri" w:cs="Calibri"/>
         <w:color w:val="22262B"/>
         <w:sz w:val="22"/>
         <w:szCs w:val="22"/>
+        <w:lang w:val="en-GB" w:eastAsia="en-GB" w:bidi="ar-SA"/>
       </w:rPr>
     </w:rPrDefault>
     <w:pPrDefault/>
   </w:docDefaults>
-  <w:style w:type="paragraph" w:styleId="Title">
-    <w:name w:val="Title"/>
-    <w:basedOn w:val="Normal"/>
-    <w:next w:val="Normal"/>
+  <w:latentStyles w:defLockedState="0" w:defUIPriority="99" w:defSemiHidden="0" w:defUnhideWhenUsed="0" w:defQFormat="0" w:count="376">
+    <w:lsdException w:name="Normal" w:uiPriority="0" w:qFormat="1"/>
+    <w:lsdException w:name="heading 1" w:uiPriority="9" w:qFormat="1"/>
+    <w:lsdException w:name="heading 2" w:semiHidden="1" w:uiPriority="9" w:unhideWhenUsed="1" w:qFormat="1"/>
+    <w:lsdException w:name="heading 3" w:semiHidden="1" w:uiPriority="9" w:unhideWhenUsed="1" w:qFormat="1"/>
+    <w:lsdException w:name="heading 4" w:semiHidden="1" w:uiPriority="9" w:unhideWhenUsed="1" w:qFormat="1"/>
+    <w:lsdException w:name="heading 5" w:semiHidden="1" w:uiPriority="9" w:unhideWhenUsed="1" w:qFormat="1"/>
+    <w:lsdException w:name="heading 6" w:semiHidden="1" w:uiPriority="9" w:unhideWhenUsed="1" w:qFormat="1"/>
+    <w:lsdException w:name="heading 7" w:semiHidden="1" w:uiPriority="9" w:unhideWhenUsed="1" w:qFormat="1"/>
+    <w:lsdException w:name="heading 8" w:semiHidden="1" w:uiPriority="9" w:unhideWhenUsed="1" w:qFormat="1"/>
+    <w:lsdException w:name="heading 9" w:semiHidden="1" w:uiPriority="9" w:unhideWhenUsed="1" w:qFormat="1"/>
+    <w:lsdException w:name="index 1" w:semiHidden="1" w:unhideWhenUsed="1"/>
+    <w:lsdException w:name="index 2" w:semiHidden="1" w:unhideWhenUsed="1"/>
+    <w:lsdException w:name="index 3" w:semiHidden="1" w:unhideWhenUsed="1"/>
+    <w:lsdException w:name="index 4" w:semiHidden="1" w:unhideWhenUsed="1"/>
+    <w:lsdException w:name="index 5" w:semiHidden="1" w:unhideWhenUsed="1"/>
+    <w:lsdException w:name="index 6" w:semiHidden="1" w:unhideWhenUsed="1"/>
+    <w:lsdException w:name="index 7" w:semiHidden="1" w:unhideWhenUsed="1"/>
+    <w:lsdException w:name="index 8" w:semiHidden="1" w:unhideWhenUsed="1"/>
+    <w:lsdException w:name="index 9" w:semiHidden="1" w:unhideWhenUsed="1"/>
+    <w:lsdException w:name="toc 1" w:semiHidden="1" w:uiPriority="39" w:unhideWhenUsed="1"/>
+    <w:lsdException w:name="toc 2" w:semiHidden="1" w:uiPriority="39" w:unhideWhenUsed="1"/>
+    <w:lsdException w:name="toc 3" w:semiHidden="1" w:uiPriority="39" w:unhideWhenUsed="1"/>
+    <w:lsdException w:name="toc 4" w:semiHidden="1" w:uiPriority="39" w:unhideWhenUsed="1"/>
+    <w:lsdException w:name="toc 5" w:semiHidden="1" w:uiPriority="39" w:unhideWhenUsed="1"/>
+    <w:lsdException w:name="toc 6" w:semiHidden="1" w:uiPriority="39" w:unhideWhenUsed="1"/>
+    <w:lsdException w:name="toc 7" w:semiHidden="1" w:uiPriority="39" w:unhideWhenUsed="1"/>
+    <w:lsdException w:name="toc 8" w:semiHidden="1" w:uiPriority="39" w:unhideWhenUsed="1"/>
+    <w:lsdException w:name="toc 9" w:semiHidden="1" w:uiPriority="39" w:unhideWhenUsed="1"/>
+    <w:lsdException w:name="Normal Indent" w:semiHidden="1" w:unhideWhenUsed="1"/>
+    <w:lsdException w:name="footnote text" w:semiHidden="1" w:unhideWhenUsed="1"/>
+    <w:lsdException w:name="annotation text" w:semiHidden="1" w:unhideWhenUsed="1"/>
+    <w:lsdException w:name="header" w:semiHidden="1" w:unhideWhenUsed="1"/>
+    <w:lsdException w:name="footer" w:semiHidden="1" w:unhideWhenUsed="1"/>
+    <w:lsdException w:name="index heading" w:semiHidden="1" w:unhideWhenUsed="1"/>
+    <w:lsdException w:name="caption" w:semiHidden="1" w:uiPriority="35" w:unhideWhenUsed="1" w:qFormat="1"/>
+    <w:lsdException w:name="table of figures" w:semiHidden="1" w:unhideWhenUsed="1"/>
+    <w:lsdException w:name="envelope address" w:semiHidden="1" w:unhideWhenUsed="1"/>
+    <w:lsdException w:name="envelope return" w:semiHidden="1" w:unhideWhenUsed="1"/>
+    <w:lsdException w:name="footnote reference" w:semiHidden="1" w:unhideWhenUsed="1"/>
+    <w:lsdException w:name="annotation reference" w:semiHidden="1" w:unhideWhenUsed="1"/>
+    <w:lsdException w:name="line number" w:semiHidden="1" w:unhideWhenUsed="1"/>
+    <w:lsdException w:name="page number" w:semiHidden="1" w:unhideWhenUsed="1"/>
+    <w:lsdException w:name="endnote reference" w:semiHidden="1" w:unhideWhenUsed="1"/>
+    <w:lsdException w:name="endnote text" w:semiHidden="1" w:unhideWhenUsed="1"/>
+    <w:lsdException w:name="table of authorities" w:semiHidden="1" w:unhideWhenUsed="1"/>
+    <w:lsdException w:name="macro" w:semiHidden="1" w:unhideWhenUsed="1"/>
+    <w:lsdException w:name="toa heading" w:semiHidden="1" w:unhideWhenUsed="1"/>
+    <w:lsdException w:name="List" w:semiHidden="1" w:unhideWhenUsed="1"/>
+    <w:lsdException w:name="List Bullet" w:semiHidden="1" w:unhideWhenUsed="1"/>
+    <w:lsdException w:name="List Number" w:semiHidden="1" w:unhideWhenUsed="1"/>
+    <w:lsdException w:name="List 2" w:semiHidden="1" w:unhideWhenUsed="1"/>
+    <w:lsdException w:name="List 3" w:semiHidden="1" w:unhideWhenUsed="1"/>
+    <w:lsdException w:name="List 4" w:semiHidden="1" w:unhideWhenUsed="1"/>
+    <w:lsdException w:name="List 5" w:semiHidden="1" w:unhideWhenUsed="1"/>
+    <w:lsdException w:name="List Bullet 2" w:semiHidden="1" w:unhideWhenUsed="1"/>
+    <w:lsdException w:name="List Bullet 3" w:semiHidden="1" w:unhideWhenUsed="1"/>
+    <w:lsdException w:name="List Bullet 4" w:semiHidden="1" w:unhideWhenUsed="1"/>
+    <w:lsdException w:name="List Bullet 5" w:semiHidden="1" w:unhideWhenUsed="1"/>
+    <w:lsdException w:name="List Number 2" w:semiHidden="1" w:unhideWhenUsed="1"/>
+    <w:lsdException w:name="List Number 3" w:semiHidden="1" w:unhideWhenUsed="1"/>
+    <w:lsdException w:name="List Number 4" w:semiHidden="1" w:unhideWhenUsed="1"/>
+    <w:lsdException w:name="List Number 5" w:semiHidden="1" w:unhideWhenUsed="1"/>
+    <w:lsdException w:name="Title" w:uiPriority="10" w:qFormat="1"/>
+    <w:lsdException w:name="Closing" w:semiHidden="1" w:unhideWhenUsed="1"/>
+    <w:lsdException w:name="Signature" w:semiHidden="1" w:unhideWhenUsed="1"/>
+    <w:lsdException w:name="Default Paragraph Font" w:semiHidden="1" w:uiPriority="1" w:unhideWhenUsed="1"/>
+    <w:lsdException w:name="Body Text" w:semiHidden="1" w:unhideWhenUsed="1"/>
+    <w:lsdException w:name="Body Text Indent" w:semiHidden="1" w:unhideWhenUsed="1"/>
+    <w:lsdException w:name="List Continue" w:semiHidden="1" w:unhideWhenUsed="1"/>
+    <w:lsdException w:name="List Continue 2" w:semiHidden="1" w:unhideWhenUsed="1"/>
+    <w:lsdException w:name="List Continue 3" w:semiHidden="1" w:unhideWhenUsed="1"/>
+    <w:lsdException w:name="List Continue 4" w:semiHidden="1" w:unhideWhenUsed="1"/>
+    <w:lsdException w:name="List Continue 5" w:semiHidden="1" w:unhideWhenUsed="1"/>
+    <w:lsdException w:name="Message Header" w:semiHidden="1" w:unhideWhenUsed="1"/>
+    <w:lsdException w:name="Subtitle" w:uiPriority="11" w:qFormat="1"/>
+    <w:lsdException w:name="Salutation" w:semiHidden="1" w:unhideWhenUsed="1"/>
+    <w:lsdException w:name="Date" w:semiHidden="1" w:unhideWhenUsed="1"/>
+    <w:lsdException w:name="Body Text First Indent" w:semiHidden="1" w:unhideWhenUsed="1"/>
+    <w:lsdException w:name="Body Text First Indent 2" w:semiHidden="1" w:unhideWhenUsed="1"/>
+    <w:lsdException w:name="Note Heading" w:semiHidden="1" w:unhideWhenUsed="1"/>
+    <w:lsdException w:name="Body Text 2" w:semiHidden="1" w:unhideWhenUsed="1"/>
+    <w:lsdException w:name="Body Text 3" w:semiHidden="1" w:unhideWhenUsed="1"/>
+    <w:lsdException w:name="Body Text Indent 2" w:semiHidden="1" w:unhideWhenUsed="1"/>
+    <w:lsdException w:name="Body Text Indent 3" w:semiHidden="1" w:unhideWhenUsed="1"/>
+    <w:lsdException w:name="Block Text" w:semiHidden="1" w:unhideWhenUsed="1"/>
+    <w:lsdException w:name="Hyperlink" w:semiHidden="1" w:unhideWhenUsed="1"/>
+    <w:lsdException w:name="FollowedHyperlink" w:semiHidden="1" w:unhideWhenUsed="1"/>
+    <w:lsdException w:name="Strong" w:uiPriority="22" w:qFormat="1"/>
+    <w:lsdException w:name="Emphasis" w:uiPriority="20" w:qFormat="1"/>
+    <w:lsdException w:name="Document Map" w:semiHidden="1" w:unhideWhenUsed="1"/>
+    <w:lsdException w:name="Plain Text" w:semiHidden="1" w:unhideWhenUsed="1"/>
+    <w:lsdException w:name="E-mail Signature" w:semiHidden="1" w:unhideWhenUsed="1"/>
+    <w:lsdException w:name="HTML Top of Form" w:semiHidden="1" w:unhideWhenUsed="1"/>
+    <w:lsdException w:name="HTML Bottom of Form" w:semiHidden="1" w:unhideWhenUsed="1"/>
+    <w:lsdException w:name="Normal (Web)" w:semiHidden="1" w:unhideWhenUsed="1"/>
+    <w:lsdException w:name="HTML Acronym" w:semiHidden="1" w:unhideWhenUsed="1"/>
+    <w:lsdException w:name="HTML Address" w:semiHidden="1" w:unhideWhenUsed="1"/>
+    <w:lsdException w:name="HTML Cite" w:semiHidden="1" w:unhideWhenUsed="1"/>
+    <w:lsdException w:name="HTML Code" w:semiHidden="1" w:unhideWhenUsed="1"/>
+    <w:lsdException w:name="HTML Definition" w:semiHidden="1" w:unhideWhenUsed="1"/>
+    <w:lsdException w:name="HTML Keyboard" w:semiHidden="1" w:unhideWhenUsed="1"/>
+    <w:lsdException w:name="HTML Preformatted" w:semiHidden="1" w:unhideWhenUsed="1"/>
+    <w:lsdException w:name="HTML Sample" w:semiHidden="1" w:unhideWhenUsed="1"/>
+    <w:lsdException w:name="HTML Typewriter" w:semiHidden="1" w:unhideWhenUsed="1"/>
+    <w:lsdException w:name="HTML Variable" w:semiHidden="1" w:unhideWhenUsed="1"/>
+    <w:lsdException w:name="Normal Table" w:semiHidden="1" w:unhideWhenUsed="1"/>
+    <w:lsdException w:name="annotation subject" w:semiHidden="1" w:unhideWhenUsed="1"/>
+    <w:lsdException w:name="No List" w:semiHidden="1" w:unhideWhenUsed="1"/>
+    <w:lsdException w:name="Outline List 1" w:semiHidden="1" w:unhideWhenUsed="1"/>
+    <w:lsdException w:name="Outline List 2" w:semiHidden="1" w:unhideWhenUsed="1"/>
+    <w:lsdException w:name="Outline List 3" w:semiHidden="1" w:unhideWhenUsed="1"/>
+    <w:lsdException w:name="Table Simple 1" w:semiHidden="1" w:unhideWhenUsed="1"/>
+    <w:lsdException w:name="Table Simple 2" w:semiHidden="1" w:unhideWhenUsed="1"/>
+    <w:lsdException w:name="Table Simple 3" w:semiHidden="1" w:unhideWhenUsed="1"/>
+    <w:lsdException w:name="Table Classic 1" w:semiHidden="1" w:unhideWhenUsed="1"/>
+    <w:lsdException w:name="Table Classic 2" w:semiHidden="1" w:unhideWhenUsed="1"/>
+    <w:lsdException w:name="Table Classic 3" w:semiHidden="1" w:unhideWhenUsed="1"/>
+    <w:lsdException w:name="Table Classic 4" w:semiHidden="1" w:unhideWhenUsed="1"/>
+    <w:lsdException w:name="Table Colorful 1" w:semiHidden="1" w:unhideWhenUsed="1"/>
+    <w:lsdException w:name="Table Colorful 2" w:semiHidden="1" w:unhideWhenUsed="1"/>
+    <w:lsdException w:name="Table Colorful 3" w:semiHidden="1" w:unhideWhenUsed="1"/>
+    <w:lsdException w:name="Table Columns 1" w:semiHidden="1" w:unhideWhenUsed="1"/>
+    <w:lsdException w:name="Table Columns 2" w:semiHidden="1" w:unhideWhenUsed="1"/>
+    <w:lsdException w:name="Table Columns 3" w:semiHidden="1" w:unhideWhenUsed="1"/>
+    <w:lsdException w:name="Table Columns 4" w:semiHidden="1" w:unhideWhenUsed="1"/>
+    <w:lsdException w:name="Table Columns 5" w:semiHidden="1" w:unhideWhenUsed="1"/>
+    <w:lsdException w:name="Table Grid 1" w:semiHidden="1" w:unhideWhenUsed="1"/>
+    <w:lsdException w:name="Table Grid 2" w:semiHidden="1" w:unhideWhenUsed="1"/>
+    <w:lsdException w:name="Table Grid 3" w:semiHidden="1" w:unhideWhenUsed="1"/>
+    <w:lsdException w:name="Table Grid 4" w:semiHidden="1" w:unhideWhenUsed="1"/>
+    <w:lsdException w:name="Table Grid 5" w:semiHidden="1" w:unhideWhenUsed="1"/>
+    <w:lsdException w:name="Table Grid 6" w:semiHidden="1" w:unhideWhenUsed="1"/>
+    <w:lsdException w:name="Table Grid 7" w:semiHidden="1" w:unhideWhenUsed="1"/>
+    <w:lsdException w:name="Table Grid 8" w:semiHidden="1" w:unhideWhenUsed="1"/>
+    <w:lsdException w:name="Table List 1" w:semiHidden="1" w:unhideWhenUsed="1"/>
+    <w:lsdException w:name="Table List 2" w:semiHidden="1" w:unhideWhenUsed="1"/>
+    <w:lsdException w:name="Table List 3" w:semiHidden="1" w:unhideWhenUsed="1"/>
+    <w:lsdException w:name="Table List 4" w:semiHidden="1" w:unhideWhenUsed="1"/>
+    <w:lsdException w:name="Table List 5" w:semiHidden="1" w:unhideWhenUsed="1"/>
+    <w:lsdException w:name="Table List 6" w:semiHidden="1" w:unhideWhenUsed="1"/>
+    <w:lsdException w:name="Table List 7" w:semiHidden="1" w:unhideWhenUsed="1"/>
+    <w:lsdException w:name="Table List 8" w:semiHidden="1" w:unhideWhenUsed="1"/>
+    <w:lsdException w:name="Table 3D effects 1" w:semiHidden="1" w:unhideWhenUsed="1"/>
+    <w:lsdException w:name="Table 3D effects 2" w:semiHidden="1" w:unhideWhenUsed="1"/>
+    <w:lsdException w:name="Table 3D effects 3" w:semiHidden="1" w:unhideWhenUsed="1"/>
+    <w:lsdException w:name="Table Contemporary" w:semiHidden="1" w:unhideWhenUsed="1"/>
+    <w:lsdException w:name="Table Elegant" w:semiHidden="1" w:unhideWhenUsed="1"/>
+    <w:lsdException w:name="Table Professional" w:semiHidden="1" w:unhideWhenUsed="1"/>
+    <w:lsdException w:name="Table Subtle 1" w:semiHidden="1" w:unhideWhenUsed="1"/>
+    <w:lsdException w:name="Table Subtle 2" w:semiHidden="1" w:unhideWhenUsed="1"/>
+    <w:lsdException w:name="Table Web 1" w:semiHidden="1" w:unhideWhenUsed="1"/>
+    <w:lsdException w:name="Table Web 2" w:semiHidden="1" w:unhideWhenUsed="1"/>
+    <w:lsdException w:name="Table Web 3" w:semiHidden="1" w:unhideWhenUsed="1"/>
+    <w:lsdException w:name="Balloon Text" w:semiHidden="1" w:unhideWhenUsed="1"/>
+    <w:lsdException w:name="Table Grid" w:uiPriority="39"/>
+    <w:lsdException w:name="Table Theme" w:semiHidden="1" w:unhideWhenUsed="1"/>
+    <w:lsdException w:name="Placeholder Text" w:semiHidden="1"/>
+    <w:lsdException w:name="No Spacing" w:uiPriority="1" w:qFormat="1"/>
+    <w:lsdException w:name="Light Shading" w:uiPriority="60"/>
+    <w:lsdException w:name="Light List" w:uiPriority="61"/>
+    <w:lsdException w:name="Light Grid" w:uiPriority="62"/>
+    <w:lsdException w:name="Medium Shading 1" w:uiPriority="63"/>
+    <w:lsdException w:name="Medium Shading 2" w:uiPriority="64"/>
+    <w:lsdException w:name="Medium List 1" w:uiPriority="65"/>
+    <w:lsdException w:name="Medium List 2" w:uiPriority="66"/>
+    <w:lsdException w:name="Medium Grid 1" w:uiPriority="67"/>
+    <w:lsdException w:name="Medium Grid 2" w:uiPriority="68"/>
+    <w:lsdException w:name="Medium Grid 3" w:uiPriority="69"/>
+    <w:lsdException w:name="Dark List" w:uiPriority="70"/>
+    <w:lsdException w:name="Colorful Shading" w:uiPriority="71"/>
+    <w:lsdException w:name="Colorful List" w:uiPriority="72"/>
+    <w:lsdException w:name="Colorful Grid" w:uiPriority="73"/>
+    <w:lsdException w:name="Light Shading Accent 1" w:uiPriority="60"/>
+    <w:lsdException w:name="Light List Accent 1" w:uiPriority="61"/>
+    <w:lsdException w:name="Light Grid Accent 1" w:uiPriority="62"/>
+    <w:lsdException w:name="Medium Shading 1 Accent 1" w:uiPriority="63"/>
+    <w:lsdException w:name="Medium Shading 2 Accent 1" w:uiPriority="64"/>
+    <w:lsdException w:name="Medium List 1 Accent 1" w:uiPriority="65"/>
+    <w:lsdException w:name="Revision" w:semiHidden="1"/>
+    <w:lsdException w:name="List Paragraph" w:uiPriority="34" w:qFormat="1"/>
+    <w:lsdException w:name="Quote" w:uiPriority="29" w:qFormat="1"/>
+    <w:lsdException w:name="Intense Quote" w:uiPriority="30" w:qFormat="1"/>
+    <w:lsdException w:name="Medium List 2 Accent 1" w:uiPriority="66"/>
+    <w:lsdException w:name="Medium Grid 1 Accent 1" w:uiPriority="67"/>
+    <w:lsdException w:name="Medium Grid 2 Accent 1" w:uiPriority="68"/>
+    <w:lsdException w:name="Medium Grid 3 Accent 1" w:uiPriority="69"/>
+    <w:lsdException w:name="Dark List Accent 1" w:uiPriority="70"/>
+    <w:lsdException w:name="Colorful Shading Accent 1" w:uiPriority="71"/>
+    <w:lsdException w:name="Colorful List Accent 1" w:uiPriority="72"/>
+    <w:lsdException w:name="Colorful Grid Accent 1" w:uiPriority="73"/>
+    <w:lsdException w:name="Light Shading Accent 2" w:uiPriority="60"/>
+    <w:lsdException w:name="Light List Accent 2" w:uiPriority="61"/>
+    <w:lsdException w:name="Light Grid Accent 2" w:uiPriority="62"/>
+    <w:lsdException w:name="Medium Shading 1 Accent 2" w:uiPriority="63"/>
+    <w:lsdException w:name="Medium Shading 2 Accent 2" w:uiPriority="64"/>
+    <w:lsdException w:name="Medium List 1 Accent 2" w:uiPriority="65"/>
+    <w:lsdException w:name="Medium List 2 Accent 2" w:uiPriority="66"/>
+    <w:lsdException w:name="Medium Grid 1 Accent 2" w:uiPriority="67"/>
+    <w:lsdException w:name="Medium Grid 2 Accent 2" w:uiPriority="68"/>
+    <w:lsdException w:name="Medium Grid 3 Accent 2" w:uiPriority="69"/>
+    <w:lsdException w:name="Dark List Accent 2" w:uiPriority="70"/>
+    <w:lsdException w:name="Colorful Shading Accent 2" w:uiPriority="71"/>
+    <w:lsdException w:name="Colorful List Accent 2" w:uiPriority="72"/>
+    <w:lsdException w:name="Colorful Grid Accent 2" w:uiPriority="73"/>
+    <w:lsdException w:name="Light Shading Accent 3" w:uiPriority="60"/>
+    <w:lsdException w:name="Light List Accent 3" w:uiPriority="61"/>
+    <w:lsdException w:name="Light Grid Accent 3" w:uiPriority="62"/>
+    <w:lsdException w:name="Medium Shading 1 Accent 3" w:uiPriority="63"/>
+    <w:lsdException w:name="Medium Shading 2 Accent 3" w:uiPriority="64"/>
+    <w:lsdException w:name="Medium List 1 Accent 3" w:uiPriority="65"/>
+    <w:lsdException w:name="Medium List 2 Accent 3" w:uiPriority="66"/>
+    <w:lsdException w:name="Medium Grid 1 Accent 3" w:uiPriority="67"/>
+    <w:lsdException w:name="Medium Grid 2 Accent 3" w:uiPriority="68"/>
+    <w:lsdException w:name="Medium Grid 3 Accent 3" w:uiPriority="69"/>
+    <w:lsdException w:name="Dark List Accent 3" w:uiPriority="70"/>
+    <w:lsdException w:name="Colorful Shading Accent 3" w:uiPriority="71"/>
+    <w:lsdException w:name="Colorful List Accent 3" w:uiPriority="72"/>
+    <w:lsdException w:name="Colorful Grid Accent 3" w:uiPriority="73"/>
+    <w:lsdException w:name="Light Shading Accent 4" w:uiPriority="60"/>
+    <w:lsdException w:name="Light List Accent 4" w:uiPriority="61"/>
+    <w:lsdException w:name="Light Grid Accent 4" w:uiPriority="62"/>
+    <w:lsdException w:name="Medium Shading 1 Accent 4" w:uiPriority="63"/>
+    <w:lsdException w:name="Medium Shading 2 Accent 4" w:uiPriority="64"/>
+    <w:lsdException w:name="Medium List 1 Accent 4" w:uiPriority="65"/>
+    <w:lsdException w:name="Medium List 2 Accent 4" w:uiPriority="66"/>
+    <w:lsdException w:name="Medium Grid 1 Accent 4" w:uiPriority="67"/>
+    <w:lsdException w:name="Medium Grid 2 Accent 4" w:uiPriority="68"/>
+    <w:lsdException w:name="Medium Grid 3 Accent 4" w:uiPriority="69"/>
+    <w:lsdException w:name="Dark List Accent 4" w:uiPriority="70"/>
+    <w:lsdException w:name="Colorful Shading Accent 4" w:uiPriority="71"/>
+    <w:lsdException w:name="Colorful List Accent 4" w:uiPriority="72"/>
+    <w:lsdException w:name="Colorful Grid Accent 4" w:uiPriority="73"/>
+    <w:lsdException w:name="Light Shading Accent 5" w:uiPriority="60"/>
+    <w:lsdException w:name="Light List Accent 5" w:uiPriority="61"/>
+    <w:lsdException w:name="Light Grid Accent 5" w:uiPriority="62"/>
+    <w:lsdException w:name="Medium Shading 1 Accent 5" w:uiPriority="63"/>
+    <w:lsdException w:name="Medium Shading 2 Accent 5" w:uiPriority="64"/>
+    <w:lsdException w:name="Medium List 1 Accent 5" w:uiPriority="65"/>
+    <w:lsdException w:name="Medium List 2 Accent 5" w:uiPriority="66"/>
+    <w:lsdException w:name="Medium Grid 1 Accent 5" w:uiPriority="67"/>
+    <w:lsdException w:name="Medium Grid 2 Accent 5" w:uiPriority="68"/>
+    <w:lsdException w:name="Medium Grid 3 Accent 5" w:uiPriority="69"/>
+    <w:lsdException w:name="Dark List Accent 5" w:uiPriority="70"/>
+    <w:lsdException w:name="Colorful Shading Accent 5" w:uiPriority="71"/>
+    <w:lsdException w:name="Colorful List Accent 5" w:uiPriority="72"/>
+    <w:lsdException w:name="Colorful Grid Accent 5" w:uiPriority="73"/>
+    <w:lsdException w:name="Light Shading Accent 6" w:uiPriority="60"/>
+    <w:lsdException w:name="Light List Accent 6" w:uiPriority="61"/>
+    <w:lsdException w:name="Light Grid Accent 6" w:uiPriority="62"/>
+    <w:lsdException w:name="Medium Shading 1 Accent 6" w:uiPriority="63"/>
+    <w:lsdException w:name="Medium Shading 2 Accent 6" w:uiPriority="64"/>
+    <w:lsdException w:name="Medium List 1 Accent 6" w:uiPriority="65"/>
+    <w:lsdException w:name="Medium List 2 Accent 6" w:uiPriority="66"/>
+    <w:lsdException w:name="Medium Grid 1 Accent 6" w:uiPriority="67"/>
+    <w:lsdException w:name="Medium Grid 2 Accent 6" w:uiPriority="68"/>
+    <w:lsdException w:name="Medium Grid 3 Accent 6" w:uiPriority="69"/>
+    <w:lsdException w:name="Dark List Accent 6" w:uiPriority="70"/>
+    <w:lsdException w:name="Colorful Shading Accent 6" w:uiPriority="71"/>
+    <w:lsdException w:name="Colorful List Accent 6" w:uiPriority="72"/>
+    <w:lsdException w:name="Colorful Grid Accent 6" w:uiPriority="73"/>
+    <w:lsdException w:name="Subtle Emphasis" w:uiPriority="19" w:qFormat="1"/>
+    <w:lsdException w:name="Intense Emphasis" w:uiPriority="21" w:qFormat="1"/>
+    <w:lsdException w:name="Subtle Reference" w:uiPriority="31" w:qFormat="1"/>
+    <w:lsdException w:name="Intense Reference" w:uiPriority="32" w:qFormat="1"/>
+    <w:lsdException w:name="Book Title" w:uiPriority="33" w:qFormat="1"/>
+    <w:lsdException w:name="Bibliography" w:semiHidden="1" w:uiPriority="37" w:unhideWhenUsed="1"/>
+    <w:lsdException w:name="TOC Heading" w:semiHidden="1" w:uiPriority="39" w:unhideWhenUsed="1" w:qFormat="1"/>
+    <w:lsdException w:name="Plain Table 1" w:uiPriority="41"/>
+    <w:lsdException w:name="Plain Table 2" w:uiPriority="42"/>
+    <w:lsdException w:name="Plain Table 3" w:uiPriority="43"/>
+    <w:lsdException w:name="Plain Table 4" w:uiPriority="44"/>
+    <w:lsdException w:name="Plain Table 5" w:uiPriority="45"/>
+    <w:lsdException w:name="Grid Table Light" w:uiPriority="40"/>
+    <w:lsdException w:name="Grid Table 1 Light" w:uiPriority="46"/>
+    <w:lsdException w:name="Grid Table 2" w:uiPriority="47"/>
+    <w:lsdException w:name="Grid Table 3" w:uiPriority="48"/>
+    <w:lsdException w:name="Grid Table 4" w:uiPriority="49"/>
+    <w:lsdException w:name="Grid Table 5 Dark" w:uiPriority="50"/>
+    <w:lsdException w:name="Grid Table 6 Colorful" w:uiPriority="51"/>
+    <w:lsdException w:name="Grid Table 7 Colorful" w:uiPriority="52"/>
+    <w:lsdException w:name="Grid Table 1 Light Accent 1" w:uiPriority="46"/>
+    <w:lsdException w:name="Grid Table 2 Accent 1" w:uiPriority="47"/>
+    <w:lsdException w:name="Grid Table 3 Accent 1" w:uiPriority="48"/>
+    <w:lsdException w:name="Grid Table 4 Accent 1" w:uiPriority="49"/>
+    <w:lsdException w:name="Grid Table 5 Dark Accent 1" w:uiPriority="50"/>
+    <w:lsdException w:name="Grid Table 6 Colorful Accent 1" w:uiPriority="51"/>
+    <w:lsdException w:name="Grid Table 7 Colorful Accent 1" w:uiPriority="52"/>
+    <w:lsdException w:name="Grid Table 1 Light Accent 2" w:uiPriority="46"/>
+    <w:lsdException w:name="Grid Table 2 Accent 2" w:uiPriority="47"/>
+    <w:lsdException w:name="Grid Table 3 Accent 2" w:uiPriority="48"/>
+    <w:lsdException w:name="Grid Table 4 Accent 2" w:uiPriority="49"/>
+    <w:lsdException w:name="Grid Table 5 Dark Accent 2" w:uiPriority="50"/>
+    <w:lsdException w:name="Grid Table 6 Colorful Accent 2" w:uiPriority="51"/>
+    <w:lsdException w:name="Grid Table 7 Colorful Accent 2" w:uiPriority="52"/>
+    <w:lsdException w:name="Grid Table 1 Light Accent 3" w:uiPriority="46"/>
+    <w:lsdException w:name="Grid Table 2 Accent 3" w:uiPriority="47"/>
+    <w:lsdException w:name="Grid Table 3 Accent 3" w:uiPriority="48"/>
+    <w:lsdException w:name="Grid Table 4 Accent 3" w:uiPriority="49"/>
+    <w:lsdException w:name="Grid Table 5 Dark Accent 3" w:uiPriority="50"/>
+    <w:lsdException w:name="Grid Table 6 Colorful Accent 3" w:uiPriority="51"/>
+    <w:lsdException w:name="Grid Table 7 Colorful Accent 3" w:uiPriority="52"/>
+    <w:lsdException w:name="Grid Table 1 Light Accent 4" w:uiPriority="46"/>
+    <w:lsdException w:name="Grid Table 2 Accent 4" w:uiPriority="47"/>
+    <w:lsdException w:name="Grid Table 3 Accent 4" w:uiPriority="48"/>
+    <w:lsdException w:name="Grid Table 4 Accent 4" w:uiPriority="49"/>
+    <w:lsdException w:name="Grid Table 5 Dark Accent 4" w:uiPriority="50"/>
+    <w:lsdException w:name="Grid Table 6 Colorful Accent 4" w:uiPriority="51"/>
+    <w:lsdException w:name="Grid Table 7 Colorful Accent 4" w:uiPriority="52"/>
+    <w:lsdException w:name="Grid Table 1 Light Accent 5" w:uiPriority="46"/>
+    <w:lsdException w:name="Grid Table 2 Accent 5" w:uiPriority="47"/>
+    <w:lsdException w:name="Grid Table 3 Accent 5" w:uiPriority="48"/>
+    <w:lsdException w:name="Grid Table 4 Accent 5" w:uiPriority="49"/>
+    <w:lsdException w:name="Grid Table 5 Dark Accent 5" w:uiPriority="50"/>
+    <w:lsdException w:name="Grid Table 6 Colorful Accent 5" w:uiPriority="51"/>
+    <w:lsdException w:name="Grid Table 7 Colorful Accent 5" w:uiPriority="52"/>
+    <w:lsdException w:name="Grid Table 1 Light Accent 6" w:uiPriority="46"/>
+    <w:lsdException w:name="Grid Table 2 Accent 6" w:uiPriority="47"/>
+    <w:lsdException w:name="Grid Table 3 Accent 6" w:uiPriority="48"/>
+    <w:lsdException w:name="Grid Table 4 Accent 6" w:uiPriority="49"/>
+    <w:lsdException w:name="Grid Table 5 Dark Accent 6" w:uiPriority="50"/>
+    <w:lsdException w:name="Grid Table 6 Colorful Accent 6" w:uiPriority="51"/>
+    <w:lsdException w:name="Grid Table 7 Colorful Accent 6" w:uiPriority="52"/>
+    <w:lsdException w:name="List Table 1 Light" w:uiPriority="46"/>
+    <w:lsdException w:name="List Table 2" w:uiPriority="47"/>
+    <w:lsdException w:name="List Table 3" w:uiPriority="48"/>
+    <w:lsdException w:name="List Table 4" w:uiPriority="49"/>
+    <w:lsdException w:name="List Table 5 Dark" w:uiPriority="50"/>
+    <w:lsdException w:name="List Table 6 Colorful" w:uiPriority="51"/>
+    <w:lsdException w:name="List Table 7 Colorful" w:uiPriority="52"/>
+    <w:lsdException w:name="List Table 1 Light Accent 1" w:uiPriority="46"/>
+    <w:lsdException w:name="List Table 2 Accent 1" w:uiPriority="47"/>
+    <w:lsdException w:name="List Table 3 Accent 1" w:uiPriority="48"/>
+    <w:lsdException w:name="List Table 4 Accent 1" w:uiPriority="49"/>
+    <w:lsdException w:name="List Table 5 Dark Accent 1" w:uiPriority="50"/>
+    <w:lsdException w:name="List Table 6 Colorful Accent 1" w:uiPriority="51"/>
+    <w:lsdException w:name="List Table 7 Colorful Accent 1" w:uiPriority="52"/>
+    <w:lsdException w:name="List Table 1 Light Accent 2" w:uiPriority="46"/>
+    <w:lsdException w:name="List Table 2 Accent 2" w:uiPriority="47"/>
+    <w:lsdException w:name="List Table 3 Accent 2" w:uiPriority="48"/>
+    <w:lsdException w:name="List Table 4 Accent 2" w:uiPriority="49"/>
+    <w:lsdException w:name="List Table 5 Dark Accent 2" w:uiPriority="50"/>
+    <w:lsdException w:name="List Table 6 Colorful Accent 2" w:uiPriority="51"/>
+    <w:lsdException w:name="List Table 7 Colorful Accent 2" w:uiPriority="52"/>
+    <w:lsdException w:name="List Table 1 Light Accent 3" w:uiPriority="46"/>
+    <w:lsdException w:name="List Table 2 Accent 3" w:uiPriority="47"/>
+    <w:lsdException w:name="List Table 3 Accent 3" w:uiPriority="48"/>
+    <w:lsdException w:name="List Table 4 Accent 3" w:uiPriority="49"/>
+    <w:lsdException w:name="List Table 5 Dark Accent 3" w:uiPriority="50"/>
+    <w:lsdException w:name="List Table 6 Colorful Accent 3" w:uiPriority="51"/>
+    <w:lsdException w:name="List Table 7 Colorful Accent 3" w:uiPriority="52"/>
+    <w:lsdException w:name="List Table 1 Light Accent 4" w:uiPriority="46"/>
+    <w:lsdException w:name="List Table 2 Accent 4" w:uiPriority="47"/>
+    <w:lsdException w:name="List Table 3 Accent 4" w:uiPriority="48"/>
+    <w:lsdException w:name="List Table 4 Accent 4" w:uiPriority="49"/>
+    <w:lsdException w:name="List Table 5 Dark Accent 4" w:uiPriority="50"/>
+    <w:lsdException w:name="List Table 6 Colorful Accent 4" w:uiPriority="51"/>
+    <w:lsdException w:name="List Table 7 Colorful Accent 4" w:uiPriority="52"/>
+    <w:lsdException w:name="List Table 1 Light Accent 5" w:uiPriority="46"/>
+    <w:lsdException w:name="List Table 2 Accent 5" w:uiPriority="47"/>
+    <w:lsdException w:name="List Table 3 Accent 5" w:uiPriority="48"/>
+    <w:lsdException w:name="List Table 4 Accent 5" w:uiPriority="49"/>
+    <w:lsdException w:name="List Table 5 Dark Accent 5" w:uiPriority="50"/>
+    <w:lsdException w:name="List Table 6 Colorful Accent 5" w:uiPriority="51"/>
+    <w:lsdException w:name="List Table 7 Colorful Accent 5" w:uiPriority="52"/>
+    <w:lsdException w:name="List Table 1 Light Accent 6" w:uiPriority="46"/>
+    <w:lsdException w:name="List Table 2 Accent 6" w:uiPriority="47"/>
+    <w:lsdException w:name="List Table 3 Accent 6" w:uiPriority="48"/>
+    <w:lsdException w:name="List Table 4 Accent 6" w:uiPriority="49"/>
+    <w:lsdException w:name="List Table 5 Dark Accent 6" w:uiPriority="50"/>
+    <w:lsdException w:name="List Table 6 Colorful Accent 6" w:uiPriority="51"/>
+    <w:lsdException w:name="List Table 7 Colorful Accent 6" w:uiPriority="52"/>
+    <w:lsdException w:name="Mention" w:semiHidden="1" w:unhideWhenUsed="1"/>
+    <w:lsdException w:name="Smart Hyperlink" w:semiHidden="1" w:unhideWhenUsed="1"/>
+    <w:lsdException w:name="Hashtag" w:semiHidden="1" w:unhideWhenUsed="1"/>
+    <w:lsdException w:name="Unresolved Mention" w:semiHidden="1" w:unhideWhenUsed="1"/>
+    <w:lsdException w:name="Smart Link" w:semiHidden="1" w:unhideWhenUsed="1"/>
+  </w:latentStyles>
+  <w:style w:type="paragraph" w:default="1" w:styleId="Normal">
+    <w:name w:val="Normal"/>
     <w:qFormat/>
-    <w:rPr>
-      <w:sz w:val="56"/>
-      <w:szCs w:val="56"/>
-    </w:rPr>
   </w:style>
   <w:style w:type="paragraph" w:styleId="Heading1">
-    <w:name w:val="Heading 1"/>
-    <w:basedOn w:val="Normal"/>
-    <w:next w:val="Normal"/>
+    <w:name w:val="heading 1"/>
+    <w:uiPriority w:val="9"/>
     <w:qFormat/>
+    <w:pPr>
+      <w:outlineLvl w:val="0"/>
+    </w:pPr>
     <w:rPr>
       <w:color w:val="2E74B5"/>
       <w:sz w:val="32"/>
@@ -1466,10 +1759,14 @@
     </w:rPr>
   </w:style>
   <w:style w:type="paragraph" w:styleId="Heading2">
-    <w:name w:val="Heading 2"/>
-    <w:basedOn w:val="Normal"/>
-    <w:next w:val="Normal"/>
+    <w:name w:val="heading 2"/>
+    <w:uiPriority w:val="9"/>
+    <w:semiHidden/>
+    <w:unhideWhenUsed/>
     <w:qFormat/>
+    <w:pPr>
+      <w:outlineLvl w:val="1"/>
+    </w:pPr>
     <w:rPr>
       <w:color w:val="2E74B5"/>
       <w:sz w:val="26"/>
@@ -1477,10 +1774,14 @@
     </w:rPr>
   </w:style>
   <w:style w:type="paragraph" w:styleId="Heading3">
-    <w:name w:val="Heading 3"/>
-    <w:basedOn w:val="Normal"/>
-    <w:next w:val="Normal"/>
+    <w:name w:val="heading 3"/>
+    <w:uiPriority w:val="9"/>
+    <w:semiHidden/>
+    <w:unhideWhenUsed/>
     <w:qFormat/>
+    <w:pPr>
+      <w:outlineLvl w:val="2"/>
+    </w:pPr>
     <w:rPr>
       <w:color w:val="1F4D78"/>
       <w:sz w:val="24"/>
@@ -1488,10 +1789,14 @@
     </w:rPr>
   </w:style>
   <w:style w:type="paragraph" w:styleId="Heading4">
-    <w:name w:val="Heading 4"/>
-    <w:basedOn w:val="Normal"/>
-    <w:next w:val="Normal"/>
+    <w:name w:val="heading 4"/>
+    <w:uiPriority w:val="9"/>
+    <w:semiHidden/>
+    <w:unhideWhenUsed/>
     <w:qFormat/>
+    <w:pPr>
+      <w:outlineLvl w:val="3"/>
+    </w:pPr>
     <w:rPr>
       <w:i/>
       <w:iCs/>
@@ -1499,27 +1804,69 @@
     </w:rPr>
   </w:style>
   <w:style w:type="paragraph" w:styleId="Heading5">
-    <w:name w:val="Heading 5"/>
-    <w:basedOn w:val="Normal"/>
-    <w:next w:val="Normal"/>
+    <w:name w:val="heading 5"/>
+    <w:uiPriority w:val="9"/>
+    <w:semiHidden/>
+    <w:unhideWhenUsed/>
     <w:qFormat/>
+    <w:pPr>
+      <w:outlineLvl w:val="4"/>
+    </w:pPr>
     <w:rPr>
       <w:color w:val="2E74B5"/>
     </w:rPr>
   </w:style>
   <w:style w:type="paragraph" w:styleId="Heading6">
-    <w:name w:val="Heading 6"/>
-    <w:basedOn w:val="Normal"/>
-    <w:next w:val="Normal"/>
+    <w:name w:val="heading 6"/>
+    <w:uiPriority w:val="9"/>
+    <w:semiHidden/>
+    <w:unhideWhenUsed/>
     <w:qFormat/>
+    <w:pPr>
+      <w:outlineLvl w:val="5"/>
+    </w:pPr>
     <w:rPr>
       <w:color w:val="1F4D78"/>
     </w:rPr>
   </w:style>
-  <w:style w:type="paragraph" w:styleId="Strong">
-    <w:name w:val="Strong"/>
-    <w:basedOn w:val="Normal"/>
-    <w:next w:val="Normal"/>
+  <w:style w:type="character" w:default="1" w:styleId="DefaultParagraphFont">
+    <w:name w:val="Default Paragraph Font"/>
+    <w:uiPriority w:val="1"/>
+    <w:semiHidden/>
+    <w:unhideWhenUsed/>
+  </w:style>
+  <w:style w:type="table" w:default="1" w:styleId="TableNormal">
+    <w:name w:val="Normal Table"/>
+    <w:uiPriority w:val="99"/>
+    <w:semiHidden/>
+    <w:unhideWhenUsed/>
+    <w:tblPr>
+      <w:tblInd w:w="0" w:type="dxa"/>
+      <w:tblCellMar>
+        <w:top w:w="0" w:type="dxa"/>
+        <w:left w:w="108" w:type="dxa"/>
+        <w:bottom w:w="0" w:type="dxa"/>
+        <w:right w:w="108" w:type="dxa"/>
+      </w:tblCellMar>
+    </w:tblPr>
+  </w:style>
+  <w:style w:type="numbering" w:default="1" w:styleId="NoList">
+    <w:name w:val="No List"/>
+    <w:uiPriority w:val="99"/>
+    <w:semiHidden/>
+    <w:unhideWhenUsed/>
+  </w:style>
+  <w:style w:type="paragraph" w:styleId="Title">
+    <w:name w:val="Title"/>
+    <w:uiPriority w:val="10"/>
+    <w:qFormat/>
+    <w:rPr>
+      <w:sz w:val="56"/>
+      <w:szCs w:val="56"/>
+    </w:rPr>
+  </w:style>
+  <w:style w:type="paragraph" w:customStyle="1" w:styleId="Strong1">
+    <w:name w:val="Strong1"/>
     <w:qFormat/>
     <w:rPr>
       <w:b/>
@@ -1528,12 +1875,10 @@
   </w:style>
   <w:style w:type="paragraph" w:styleId="ListParagraph">
     <w:name w:val="List Paragraph"/>
-    <w:basedOn w:val="Normal"/>
     <w:qFormat/>
   </w:style>
   <w:style w:type="character" w:styleId="Hyperlink">
     <w:name w:val="Hyperlink"/>
-    <w:basedOn w:val="DefaultParagraphFont"/>
     <w:uiPriority w:val="99"/>
     <w:unhideWhenUsed/>
     <w:rPr>
@@ -1543,7 +1888,6 @@
   </w:style>
   <w:style w:type="character" w:styleId="FootnoteReference">
     <w:name w:val="footnote reference"/>
-    <w:basedOn w:val="DefaultParagraphFont"/>
     <w:uiPriority w:val="99"/>
     <w:semiHidden/>
     <w:unhideWhenUsed/>
@@ -1553,22 +1897,17 @@
   </w:style>
   <w:style w:type="paragraph" w:styleId="FootnoteText">
     <w:name w:val="footnote text"/>
-    <w:basedOn w:val="Normal"/>
     <w:link w:val="FootnoteTextChar"/>
     <w:uiPriority w:val="99"/>
     <w:semiHidden/>
     <w:unhideWhenUsed/>
-    <w:pPr>
-      <w:spacing w:after="0" w:line="240" w:lineRule="auto"/>
-    </w:pPr>
     <w:rPr>
       <w:sz w:val="20"/>
       <w:szCs w:val="20"/>
     </w:rPr>
   </w:style>
-  <w:style w:type="character" w:styleId="FootnoteTextChar">
+  <w:style w:type="character" w:customStyle="1" w:styleId="FootnoteTextChar">
     <w:name w:val="Footnote Text Char"/>
-    <w:basedOn w:val="DefaultParagraphFont"/>
     <w:link w:val="FootnoteText"/>
     <w:uiPriority w:val="99"/>
     <w:semiHidden/>
@@ -1580,7 +1919,6 @@
   </w:style>
   <w:style w:type="character" w:styleId="EndnoteReference">
     <w:name w:val="endnote reference"/>
-    <w:basedOn w:val="DefaultParagraphFont"/>
     <w:uiPriority w:val="99"/>
     <w:semiHidden/>
     <w:unhideWhenUsed/>
@@ -1590,22 +1928,17 @@
   </w:style>
   <w:style w:type="paragraph" w:styleId="EndnoteText">
     <w:name w:val="endnote text"/>
-    <w:basedOn w:val="Normal"/>
     <w:link w:val="EndnoteTextChar"/>
     <w:uiPriority w:val="99"/>
     <w:semiHidden/>
     <w:unhideWhenUsed/>
-    <w:pPr>
-      <w:spacing w:after="0" w:line="240" w:lineRule="auto"/>
-    </w:pPr>
     <w:rPr>
       <w:sz w:val="20"/>
       <w:szCs w:val="20"/>
     </w:rPr>
   </w:style>
-  <w:style w:type="character" w:styleId="EndnoteTextChar">
+  <w:style w:type="character" w:customStyle="1" w:styleId="EndnoteTextChar">
     <w:name w:val="Endnote Text Char"/>
-    <w:basedOn w:val="DefaultParagraphFont"/>
     <w:link w:val="EndnoteText"/>
     <w:uiPriority w:val="99"/>
     <w:semiHidden/>
@@ -1616,4 +1949,319 @@
     </w:rPr>
   </w:style>
 </w:styles>
+</file>
+
+<file path=word/theme/theme1.xml><?xml version="1.0" encoding="utf-8"?>
+<a:theme xmlns:a="http://schemas.openxmlformats.org/drawingml/2006/main" name="Office Theme">
+  <a:themeElements>
+    <a:clrScheme name="Office">
+      <a:dk1>
+        <a:sysClr val="windowText" lastClr="000000"/>
+      </a:dk1>
+      <a:lt1>
+        <a:sysClr val="window" lastClr="FFFFFF"/>
+      </a:lt1>
+      <a:dk2>
+        <a:srgbClr val="0E2841"/>
+      </a:dk2>
+      <a:lt2>
+        <a:srgbClr val="E8E8E8"/>
+      </a:lt2>
+      <a:accent1>
+        <a:srgbClr val="156082"/>
+      </a:accent1>
+      <a:accent2>
+        <a:srgbClr val="E97132"/>
+      </a:accent2>
+      <a:accent3>
+        <a:srgbClr val="196B24"/>
+      </a:accent3>
+      <a:accent4>
+        <a:srgbClr val="0F9ED5"/>
+      </a:accent4>
+      <a:accent5>
+        <a:srgbClr val="A02B93"/>
+      </a:accent5>
+      <a:accent6>
+        <a:srgbClr val="4EA72E"/>
+      </a:accent6>
+      <a:hlink>
+        <a:srgbClr val="467886"/>
+      </a:hlink>
+      <a:folHlink>
+        <a:srgbClr val="96607D"/>
+      </a:folHlink>
+    </a:clrScheme>
+    <a:fontScheme name="Office">
+      <a:majorFont>
+        <a:latin typeface="Aptos Display" panose="02110004020202020204"/>
+        <a:ea typeface=""/>
+        <a:cs typeface=""/>
+        <a:font script="Jpan" typeface="游ゴシック Light"/>
+        <a:font script="Hang" typeface="맑은 고딕"/>
+        <a:font script="Hans" typeface="等线 Light"/>
+        <a:font script="Hant" typeface="新細明體"/>
+        <a:font script="Arab" typeface="Times New Roman"/>
+        <a:font script="Hebr" typeface="Times New Roman"/>
+        <a:font script="Thai" typeface="Angsana New"/>
+        <a:font script="Ethi" typeface="Nyala"/>
+        <a:font script="Beng" typeface="Vrinda"/>
+        <a:font script="Gujr" typeface="Shruti"/>
+        <a:font script="Khmr" typeface="MoolBoran"/>
+        <a:font script="Knda" typeface="Tunga"/>
+        <a:font script="Guru" typeface="Raavi"/>
+        <a:font script="Cans" typeface="Euphemia"/>
+        <a:font script="Cher" typeface="Plantagenet Cherokee"/>
+        <a:font script="Yiii" typeface="Microsoft Yi Baiti"/>
+        <a:font script="Tibt" typeface="Microsoft Himalaya"/>
+        <a:font script="Thaa" typeface="MV Boli"/>
+        <a:font script="Deva" typeface="Mangal"/>
+        <a:font script="Telu" typeface="Gautami"/>
+        <a:font script="Taml" typeface="Latha"/>
+        <a:font script="Syrc" typeface="Estrangelo Edessa"/>
+        <a:font script="Orya" typeface="Kalinga"/>
+        <a:font script="Mlym" typeface="Kartika"/>
+        <a:font script="Laoo" typeface="DokChampa"/>
+        <a:font script="Sinh" typeface="Iskoola Pota"/>
+        <a:font script="Mong" typeface="Mongolian Baiti"/>
+        <a:font script="Viet" typeface="Times New Roman"/>
+        <a:font script="Uigh" typeface="Microsoft Uighur"/>
+        <a:font script="Geor" typeface="Sylfaen"/>
+        <a:font script="Armn" typeface="Arial"/>
+        <a:font script="Bugi" typeface="Leelawadee UI"/>
+        <a:font script="Bopo" typeface="Microsoft JhengHei"/>
+        <a:font script="Java" typeface="Javanese Text"/>
+        <a:font script="Lisu" typeface="Segoe UI"/>
+        <a:font script="Mymr" typeface="Myanmar Text"/>
+        <a:font script="Nkoo" typeface="Ebrima"/>
+        <a:font script="Olck" typeface="Nirmala UI"/>
+        <a:font script="Osma" typeface="Ebrima"/>
+        <a:font script="Phag" typeface="Phagspa"/>
+        <a:font script="Syrn" typeface="Estrangelo Edessa"/>
+        <a:font script="Syrj" typeface="Estrangelo Edessa"/>
+        <a:font script="Syre" typeface="Estrangelo Edessa"/>
+        <a:font script="Sora" typeface="Nirmala UI"/>
+        <a:font script="Tale" typeface="Microsoft Tai Le"/>
+        <a:font script="Talu" typeface="Microsoft New Tai Lue"/>
+        <a:font script="Tfng" typeface="Ebrima"/>
+      </a:majorFont>
+      <a:minorFont>
+        <a:latin typeface="Aptos" panose="02110004020202020204"/>
+        <a:ea typeface=""/>
+        <a:cs typeface=""/>
+        <a:font script="Jpan" typeface="游明朝"/>
+        <a:font script="Hang" typeface="맑은 고딕"/>
+        <a:font script="Hans" typeface="等线"/>
+        <a:font script="Hant" typeface="新細明體"/>
+        <a:font script="Arab" typeface="Arial"/>
+        <a:font script="Hebr" typeface="Arial"/>
+        <a:font script="Thai" typeface="Cordia New"/>
+        <a:font script="Ethi" typeface="Nyala"/>
+        <a:font script="Beng" typeface="Vrinda"/>
+        <a:font script="Gujr" typeface="Shruti"/>
+        <a:font script="Khmr" typeface="DaunPenh"/>
+        <a:font script="Knda" typeface="Tunga"/>
+        <a:font script="Guru" typeface="Raavi"/>
+        <a:font script="Cans" typeface="Euphemia"/>
+        <a:font script="Cher" typeface="Plantagenet Cherokee"/>
+        <a:font script="Yiii" typeface="Microsoft Yi Baiti"/>
+        <a:font script="Tibt" typeface="Microsoft Himalaya"/>
+        <a:font script="Thaa" typeface="MV Boli"/>
+        <a:font script="Deva" typeface="Mangal"/>
+        <a:font script="Telu" typeface="Gautami"/>
+        <a:font script="Taml" typeface="Latha"/>
+        <a:font script="Syrc" typeface="Estrangelo Edessa"/>
+        <a:font script="Orya" typeface="Kalinga"/>
+        <a:font script="Mlym" typeface="Kartika"/>
+        <a:font script="Laoo" typeface="DokChampa"/>
+        <a:font script="Sinh" typeface="Iskoola Pota"/>
+        <a:font script="Mong" typeface="Mongolian Baiti"/>
+        <a:font script="Viet" typeface="Arial"/>
+        <a:font script="Uigh" typeface="Microsoft Uighur"/>
+        <a:font script="Geor" typeface="Sylfaen"/>
+        <a:font script="Armn" typeface="Arial"/>
+        <a:font script="Bugi" typeface="Leelawadee UI"/>
+        <a:font script="Bopo" typeface="Microsoft JhengHei"/>
+        <a:font script="Java" typeface="Javanese Text"/>
+        <a:font script="Lisu" typeface="Segoe UI"/>
+        <a:font script="Mymr" typeface="Myanmar Text"/>
+        <a:font script="Nkoo" typeface="Ebrima"/>
+        <a:font script="Olck" typeface="Nirmala UI"/>
+        <a:font script="Osma" typeface="Ebrima"/>
+        <a:font script="Phag" typeface="Phagspa"/>
+        <a:font script="Syrn" typeface="Estrangelo Edessa"/>
+        <a:font script="Syrj" typeface="Estrangelo Edessa"/>
+        <a:font script="Syre" typeface="Estrangelo Edessa"/>
+        <a:font script="Sora" typeface="Nirmala UI"/>
+        <a:font script="Tale" typeface="Microsoft Tai Le"/>
+        <a:font script="Talu" typeface="Microsoft New Tai Lue"/>
+        <a:font script="Tfng" typeface="Ebrima"/>
+      </a:minorFont>
+    </a:fontScheme>
+    <a:fmtScheme name="Office">
+      <a:fillStyleLst>
+        <a:solidFill>
+          <a:schemeClr val="phClr"/>
+        </a:solidFill>
+        <a:gradFill rotWithShape="1">
+          <a:gsLst>
+            <a:gs pos="0">
+              <a:schemeClr val="phClr">
+                <a:lumMod val="110000"/>
+                <a:satMod val="105000"/>
+                <a:tint val="67000"/>
+              </a:schemeClr>
+            </a:gs>
+            <a:gs pos="50000">
+              <a:schemeClr val="phClr">
+                <a:lumMod val="105000"/>
+                <a:satMod val="103000"/>
+                <a:tint val="73000"/>
+              </a:schemeClr>
+            </a:gs>
+            <a:gs pos="100000">
+              <a:schemeClr val="phClr">
+                <a:lumMod val="105000"/>
+                <a:satMod val="109000"/>
+                <a:tint val="81000"/>
+              </a:schemeClr>
+            </a:gs>
+          </a:gsLst>
+          <a:lin ang="5400000" scaled="0"/>
+        </a:gradFill>
+        <a:gradFill rotWithShape="1">
+          <a:gsLst>
+            <a:gs pos="0">
+              <a:schemeClr val="phClr">
+                <a:satMod val="103000"/>
+                <a:lumMod val="102000"/>
+                <a:tint val="94000"/>
+              </a:schemeClr>
+            </a:gs>
+            <a:gs pos="50000">
+              <a:schemeClr val="phClr">
+                <a:satMod val="110000"/>
+                <a:lumMod val="100000"/>
+                <a:shade val="100000"/>
+              </a:schemeClr>
+            </a:gs>
+            <a:gs pos="100000">
+              <a:schemeClr val="phClr">
+                <a:lumMod val="99000"/>
+                <a:satMod val="120000"/>
+                <a:shade val="78000"/>
+              </a:schemeClr>
+            </a:gs>
+          </a:gsLst>
+          <a:lin ang="5400000" scaled="0"/>
+        </a:gradFill>
+      </a:fillStyleLst>
+      <a:lnStyleLst>
+        <a:ln w="12700" cap="flat" cmpd="sng" algn="ctr">
+          <a:solidFill>
+            <a:schemeClr val="phClr"/>
+          </a:solidFill>
+          <a:prstDash val="solid"/>
+          <a:miter lim="800000"/>
+        </a:ln>
+        <a:ln w="19050" cap="flat" cmpd="sng" algn="ctr">
+          <a:solidFill>
+            <a:schemeClr val="phClr"/>
+          </a:solidFill>
+          <a:prstDash val="solid"/>
+          <a:miter lim="800000"/>
+        </a:ln>
+        <a:ln w="25400" cap="flat" cmpd="sng" algn="ctr">
+          <a:solidFill>
+            <a:schemeClr val="phClr"/>
+          </a:solidFill>
+          <a:prstDash val="solid"/>
+          <a:miter lim="800000"/>
+        </a:ln>
+      </a:lnStyleLst>
+      <a:effectStyleLst>
+        <a:effectStyle>
+          <a:effectLst/>
+        </a:effectStyle>
+        <a:effectStyle>
+          <a:effectLst/>
+        </a:effectStyle>
+        <a:effectStyle>
+          <a:effectLst>
+            <a:outerShdw blurRad="57150" dist="19050" dir="5400000" algn="ctr" rotWithShape="0">
+              <a:srgbClr val="000000">
+                <a:alpha val="63000"/>
+              </a:srgbClr>
+            </a:outerShdw>
+          </a:effectLst>
+        </a:effectStyle>
+      </a:effectStyleLst>
+      <a:bgFillStyleLst>
+        <a:solidFill>
+          <a:schemeClr val="phClr"/>
+        </a:solidFill>
+        <a:solidFill>
+          <a:schemeClr val="phClr">
+            <a:tint val="95000"/>
+            <a:satMod val="170000"/>
+          </a:schemeClr>
+        </a:solidFill>
+        <a:gradFill rotWithShape="1">
+          <a:gsLst>
+            <a:gs pos="0">
+              <a:schemeClr val="phClr">
+                <a:tint val="93000"/>
+                <a:satMod val="150000"/>
+                <a:shade val="98000"/>
+                <a:lumMod val="102000"/>
+              </a:schemeClr>
+            </a:gs>
+            <a:gs pos="50000">
+              <a:schemeClr val="phClr">
+                <a:tint val="98000"/>
+                <a:satMod val="130000"/>
+                <a:shade val="90000"/>
+                <a:lumMod val="103000"/>
+              </a:schemeClr>
+            </a:gs>
+            <a:gs pos="100000">
+              <a:schemeClr val="phClr">
+                <a:shade val="63000"/>
+                <a:satMod val="120000"/>
+              </a:schemeClr>
+            </a:gs>
+          </a:gsLst>
+          <a:lin ang="5400000" scaled="0"/>
+        </a:gradFill>
+      </a:bgFillStyleLst>
+    </a:fmtScheme>
+  </a:themeElements>
+  <a:objectDefaults>
+    <a:lnDef>
+      <a:spPr/>
+      <a:bodyPr/>
+      <a:lstStyle/>
+      <a:style>
+        <a:lnRef idx="2">
+          <a:schemeClr val="accent1"/>
+        </a:lnRef>
+        <a:fillRef idx="0">
+          <a:schemeClr val="accent1"/>
+        </a:fillRef>
+        <a:effectRef idx="1">
+          <a:schemeClr val="accent1"/>
+        </a:effectRef>
+        <a:fontRef idx="minor">
+          <a:schemeClr val="tx1"/>
+        </a:fontRef>
+      </a:style>
+    </a:lnDef>
+  </a:objectDefaults>
+  <a:extraClrSchemeLst/>
+  <a:extLst>
+    <a:ext uri="{05A4C25C-085E-4340-85A3-A5531E510DB2}">
+      <thm15:themeFamily xmlns:thm15="http://schemas.microsoft.com/office/thememl/2012/main" name="Office Theme" id="{2E142A2C-CD16-42D6-873A-C26D2A0506FA}" vid="{1BDDFF52-6CD6-40A5-AB3C-68EB2F1E4D0A}"/>
+    </a:ext>
+  </a:extLst>
+</a:theme>
 </file>
</xml_diff>